<commit_message>
Handover guide: local-files workflow, redesigned Word/PDF
Remove all GitHub/publishing references (recipient maintains local copies);
backups become dated file copies, sharing is sending the single HTML file.
Restyle the generated documents with a branded cover band, section bars and
callout boxes.

Co-Authored-By: Claude Fable 5 <noreply@anthropic.com>
Claude-Session: https://claude.ai/code/session_01EfdgwHTKZvsSK3ggYc4z9J
</commit_message>
<xml_diff>
--- a/The-Long-Game-Handover-Guide.docx
+++ b/The-Long-Game-Handover-Guide.docx
@@ -2,88 +2,210 @@
 <file path=word/document.xml><?xml version="1.0" encoding="utf-8"?>
 <w:document xmlns:o="urn:schemas-microsoft-com:office:office" xmlns:r="http://schemas.openxmlformats.org/officeDocument/2006/relationships" xmlns:v="urn:schemas-microsoft-com:vml" xmlns:w="http://schemas.openxmlformats.org/wordprocessingml/2006/main" xmlns:w10="urn:schemas-microsoft-com:office:word" xmlns:wp="http://schemas.openxmlformats.org/drawingml/2006/wordprocessingDrawing" xmlns:wps="http://schemas.microsoft.com/office/word/2010/wordprocessingShape" xmlns:wpg="http://schemas.microsoft.com/office/word/2010/wordprocessingGroup" xmlns:mc="http://schemas.openxmlformats.org/markup-compatibility/2006" xmlns:wp14="http://schemas.microsoft.com/office/word/2010/wordprocessingDrawing" xmlns:w14="http://schemas.microsoft.com/office/word/2010/wordml" xmlns:w15="http://schemas.microsoft.com/office/word/2012/wordml" mc:Ignorable="w14 wp14 w15">
   <w:body>
-    <w:p>
-      <w:pPr>
-        <w:pStyle w:val="Heading1"/>
-        <w:bidi w:val="0"/>
-        <w:spacing w:before="240" w:after="200"/>
-        <w:jc w:val="left"/>
-        <w:rPr/>
-      </w:pPr>
-      <w:r>
-        <w:rPr/>
-        <w:t>The Long Game — Handover Guide</w:t>
-      </w:r>
-    </w:p>
-    <w:p>
-      <w:pPr>
-        <w:pStyle w:val="BodyText"/>
-        <w:bidi w:val="0"/>
-        <w:jc w:val="left"/>
-        <w:rPr/>
-      </w:pPr>
+    <w:tbl>
+      <w:tblPr>
+        <w:tblW w:w="6408" w:type="dxa"/>
+        <w:jc w:val="left"/>
+        <w:tblInd w:w="0" w:type="dxa"/>
+        <w:tblLayout w:type="fixed"/>
+        <w:tblCellMar>
+          <w:top w:w="0" w:type="dxa"/>
+          <w:left w:w="0" w:type="dxa"/>
+          <w:bottom w:w="0" w:type="dxa"/>
+          <w:right w:w="0" w:type="dxa"/>
+        </w:tblCellMar>
+      </w:tblPr>
+      <w:tblGrid>
+        <w:gridCol w:w="6408"/>
+      </w:tblGrid>
+      <w:tr>
+        <w:trPr/>
+        <w:tc>
+          <w:tcPr>
+            <w:tcW w:w="6408" w:type="dxa"/>
+            <w:tcBorders/>
+            <w:shd w:fill="083469" w:val="clear"/>
+            <w:vAlign w:val="center"/>
+          </w:tcPr>
+          <w:p>
+            <w:pPr>
+              <w:pStyle w:val="TableContents"/>
+              <w:bidi w:val="0"/>
+              <w:spacing w:before="100" w:after="100"/>
+              <w:ind w:hanging="0" w:left="0" w:right="0"/>
+              <w:jc w:val="left"/>
+              <w:rPr/>
+            </w:pPr>
+            <w:r>
+              <w:rPr>
+                <w:color w:val="00D190"/>
+                <w:spacing w:val="40"/>
+                <w:sz w:val="22"/>
+              </w:rPr>
+              <w:t>CAPITAL GROUP  ·  THE LONG GAME</w:t>
+            </w:r>
+            <w:r>
+              <w:rPr/>
+              <w:br/>
+            </w:r>
+            <w:r>
+              <w:rPr>
+                <w:b/>
+                <w:color w:val="FFFFFF"/>
+                <w:sz w:val="52"/>
+              </w:rPr>
+              <w:t>Handover Guide</w:t>
+            </w:r>
+            <w:r>
+              <w:rPr/>
+              <w:br/>
+            </w:r>
+            <w:r>
+              <w:rPr>
+                <w:color w:val="C7D3E2"/>
+                <w:sz w:val="22"/>
+              </w:rPr>
+              <w:t>Everything you need to edit, test and share the games — no coding required.</w:t>
+            </w:r>
+            <w:r>
+              <w:rPr/>
+              <w:t xml:space="preserve"> </w:t>
+            </w:r>
+          </w:p>
+        </w:tc>
+      </w:tr>
+      <w:tr>
+        <w:trPr/>
+        <w:tc>
+          <w:tcPr>
+            <w:tcW w:w="6408" w:type="dxa"/>
+            <w:tcBorders/>
+            <w:shd w:fill="008074" w:val="clear"/>
+            <w:vAlign w:val="center"/>
+          </w:tcPr>
+          <w:p>
+            <w:pPr>
+              <w:pStyle w:val="TableContents"/>
+              <w:bidi w:val="0"/>
+              <w:spacing w:before="100" w:after="100"/>
+              <w:jc w:val="left"/>
+              <w:rPr>
+                <w:sz w:val="4"/>
+                <w:szCs w:val="4"/>
+              </w:rPr>
+            </w:pPr>
+            <w:r>
+              <w:rPr>
+                <w:sz w:val="4"/>
+                <w:szCs w:val="4"/>
+              </w:rPr>
+            </w:r>
+          </w:p>
+        </w:tc>
+      </w:tr>
+    </w:tbl>
+    <w:p>
+      <w:pPr>
+        <w:pStyle w:val="BodyText"/>
+        <w:bidi w:val="0"/>
+        <w:spacing w:before="200" w:after="80"/>
+        <w:ind w:hanging="0" w:left="200" w:right="200"/>
+        <w:jc w:val="left"/>
+        <w:rPr>
+          <w:color w:val="40566A"/>
+          <w:sz w:val="21"/>
+        </w:rPr>
+      </w:pPr>
+      <w:r>
+        <w:rPr>
+          <w:b/>
+          <w:color w:val="083469"/>
+          <w:sz w:val="21"/>
+        </w:rPr>
+        <w:t>Who this is for:</w:t>
+      </w:r>
+      <w:r>
+        <w:rPr>
+          <w:color w:val="40566A"/>
+          <w:sz w:val="21"/>
+        </w:rPr>
+        <w:t xml:space="preserve"> You don’t need to know how to code. You need VS Code, GitHub Copilot, a web browser, and this guide — where things live, how to change them safely, how to test, and how to keep yourself safe with backups.</w:t>
+      </w:r>
+    </w:p>
+    <w:p>
+      <w:pPr>
+        <w:pStyle w:val="Heading2"/>
+        <w:bidi w:val="0"/>
+        <w:jc w:val="left"/>
+        <w:rPr/>
+      </w:pPr>
+      <w:r>
+        <w:rPr/>
+        <w:t>1 · What this is, in 30 seconds</w:t>
+      </w:r>
+    </w:p>
+    <w:p>
+      <w:pPr>
+        <w:pStyle w:val="BodyText"/>
+        <w:bidi w:val="0"/>
+        <w:jc w:val="left"/>
+        <w:rPr/>
+      </w:pPr>
+      <w:r>
+        <w:rPr/>
+        <w:t>"The Long Game" is a set of Capital Group-branded investing games. A player gets $50,000, faces real historical market moments without being told the dates, chooses Buy / Hold / Sell, and at the end sees the big reveal: every moment was real, and simply staying invested usually won.</w:t>
+      </w:r>
+    </w:p>
+    <w:p>
+      <w:pPr>
+        <w:pStyle w:val="BodyText"/>
+        <w:bidi w:val="0"/>
+        <w:jc w:val="left"/>
+        <w:rPr/>
+      </w:pPr>
+      <w:r>
+        <w:rPr/>
+        <w:t xml:space="preserve">Each game is </w:t>
+      </w:r>
       <w:r>
         <w:rPr>
           <w:rStyle w:val="Strong"/>
         </w:rPr>
-        <w:t>For the person taking over this project.</w:t>
-      </w:r>
-      <w:r>
-        <w:rPr/>
-        <w:t xml:space="preserve"> You don't need to know how to code. You need VS Code, GitHub Copilot, a web browser, and this guide. Everything below is written for a non-programmer — where things live, how to change them safely, how to test, and how to publish.</w:t>
-      </w:r>
-    </w:p>
-    <w:p>
-      <w:pPr>
-        <w:pStyle w:val="HorizontalLine"/>
-        <w:bidi w:val="0"/>
-        <w:jc w:val="left"/>
-        <w:rPr/>
-      </w:pPr>
-      <w:r>
-        <w:rPr/>
-      </w:r>
-    </w:p>
-    <w:p>
-      <w:pPr>
-        <w:pStyle w:val="Heading2"/>
-        <w:bidi w:val="0"/>
-        <w:jc w:val="left"/>
-        <w:rPr/>
-      </w:pPr>
-      <w:r>
-        <w:rPr/>
-        <w:t>1 · What this is, in 30 seconds</w:t>
-      </w:r>
-    </w:p>
-    <w:p>
-      <w:pPr>
-        <w:pStyle w:val="BodyText"/>
-        <w:bidi w:val="0"/>
-        <w:jc w:val="left"/>
-        <w:rPr/>
-      </w:pPr>
-      <w:r>
-        <w:rPr/>
-        <w:t>"The Long Game" is a set of Capital Group-branded investing games. A player gets $50,000, faces real historical market moments without being told the dates, chooses Buy / Hold / Sell, and at the end sees the big reveal: every moment was real, and simply staying invested usually won.</w:t>
-      </w:r>
-    </w:p>
-    <w:p>
-      <w:pPr>
-        <w:pStyle w:val="BodyText"/>
-        <w:bidi w:val="0"/>
-        <w:jc w:val="left"/>
-        <w:rPr/>
-      </w:pPr>
-      <w:r>
-        <w:rPr/>
-        <w:t xml:space="preserve">Each game is </w:t>
+        <w:t xml:space="preserve">one single </w:t>
+      </w:r>
+      <w:r>
+        <w:rPr>
+          <w:rStyle w:val="SourceText"/>
+        </w:rPr>
+        <w:t>.html</w:t>
       </w:r>
       <w:r>
         <w:rPr>
           <w:rStyle w:val="Strong"/>
         </w:rPr>
-        <w:t xml:space="preserve">one single </w:t>
+        <w:t xml:space="preserve"> file</w:t>
+      </w:r>
+      <w:r>
+        <w:rPr/>
+        <w:t xml:space="preserve"> — the words, the design, the data, and the logic are all inside that one file. Open it in a browser and it runs. There is no installation, no database, no build step. This is the most important fact in this whole document: </w:t>
+      </w:r>
+      <w:r>
+        <w:rPr>
+          <w:rStyle w:val="Strong"/>
+        </w:rPr>
+        <w:t>one file = one complete game.</w:t>
+      </w:r>
+    </w:p>
+    <w:p>
+      <w:pPr>
+        <w:pStyle w:val="BodyText"/>
+        <w:bidi w:val="0"/>
+        <w:jc w:val="left"/>
+        <w:rPr/>
+      </w:pPr>
+      <w:r>
+        <w:rPr/>
+        <w:t xml:space="preserve">That also means sharing a game is trivial: send someone the </w:t>
       </w:r>
       <w:r>
         <w:rPr>
@@ -92,20 +214,8 @@
         <w:t>.html</w:t>
       </w:r>
       <w:r>
-        <w:rPr>
-          <w:rStyle w:val="Strong"/>
-        </w:rPr>
-        <w:t xml:space="preserve"> file</w:t>
-      </w:r>
-      <w:r>
-        <w:rPr/>
-        <w:t xml:space="preserve"> — the words, the design, the data, and the logic are all inside that one file. Open it in a browser and it runs. There is no installation, no database, no build step. This is the most important fact in this whole document: </w:t>
-      </w:r>
-      <w:r>
-        <w:rPr>
-          <w:rStyle w:val="Strong"/>
-        </w:rPr>
-        <w:t>one file = one complete game.</w:t>
+        <w:rPr/>
+        <w:t xml:space="preserve"> file (email, Teams, USB stick) and they have the whole, working game.</w:t>
       </w:r>
     </w:p>
     <w:p>
@@ -163,7 +273,7 @@
             <w:pPr>
               <w:pStyle w:val="TableHeading"/>
               <w:suppressLineNumbers/>
-              <w:shd w:fill="083469" w:val="clear"/>
+              <w:shd w:fill="008074" w:val="clear"/>
               <w:bidi w:val="0"/>
               <w:spacing w:before="100" w:after="100"/>
               <w:jc w:val="left"/>
@@ -185,7 +295,7 @@
             <w:pPr>
               <w:pStyle w:val="TableHeading"/>
               <w:suppressLineNumbers/>
-              <w:shd w:fill="083469" w:val="clear"/>
+              <w:shd w:fill="008074" w:val="clear"/>
               <w:bidi w:val="0"/>
               <w:spacing w:before="100" w:after="100"/>
               <w:jc w:val="left"/>
@@ -207,7 +317,7 @@
             <w:pPr>
               <w:pStyle w:val="TableHeading"/>
               <w:suppressLineNumbers/>
-              <w:shd w:fill="083469" w:val="clear"/>
+              <w:shd w:fill="008074" w:val="clear"/>
               <w:bidi w:val="0"/>
               <w:spacing w:before="100" w:after="100"/>
               <w:jc w:val="left"/>
@@ -702,7 +812,7 @@
             </w:pPr>
             <w:r>
               <w:rPr/>
-              <w:t>This document.</w:t>
+              <w:t>This document (the master copy — the Word/PDF versions are generated from it).</w:t>
             </w:r>
           </w:p>
         </w:tc>
@@ -728,48 +838,6 @@
         </w:tc>
       </w:tr>
     </w:tbl>
-    <w:p>
-      <w:pPr>
-        <w:pStyle w:val="BodyText"/>
-        <w:bidi w:val="0"/>
-        <w:jc w:val="left"/>
-        <w:rPr/>
-      </w:pPr>
-      <w:r>
-        <w:rPr/>
-        <w:t xml:space="preserve">The public demo site (while it's up) is at: </w:t>
-      </w:r>
-      <w:r>
-        <w:rPr>
-          <w:rStyle w:val="SourceText"/>
-        </w:rPr>
-        <w:t>https://cheesin30.github.io/decisionframework/</w:t>
-      </w:r>
-      <w:r>
-        <w:rPr/>
-        <w:t xml:space="preserve"> — the Live Room is the homepage; the other games are at </w:t>
-      </w:r>
-      <w:r>
-        <w:rPr>
-          <w:rStyle w:val="SourceText"/>
-        </w:rPr>
-        <w:t>/long-term-game-learning.html</w:t>
-      </w:r>
-      <w:r>
-        <w:rPr/>
-        <w:t xml:space="preserve"> and </w:t>
-      </w:r>
-      <w:r>
-        <w:rPr>
-          <w:rStyle w:val="SourceText"/>
-        </w:rPr>
-        <w:t>/long-term-game-sales.html</w:t>
-      </w:r>
-      <w:r>
-        <w:rPr/>
-        <w:t>.</w:t>
-      </w:r>
-    </w:p>
     <w:p>
       <w:pPr>
         <w:pStyle w:val="HorizontalLine"/>
@@ -814,11 +882,31 @@
         <w:rPr>
           <w:rStyle w:val="Strong"/>
         </w:rPr>
-        <w:t>Small changes, tested immediately.</w:t>
-      </w:r>
-      <w:r>
-        <w:rPr/>
-        <w:t xml:space="preserve"> Change one thing, save, refresh the browser, play it. Never batch up ten edits and hope. </w:t>
+        <w:t>Back up before you edit.</w:t>
+      </w:r>
+      <w:r>
+        <w:rPr/>
+        <w:t xml:space="preserve"> Before every editing session, copy the game file into a </w:t>
+      </w:r>
+      <w:r>
+        <w:rPr>
+          <w:rStyle w:val="SourceText"/>
+        </w:rPr>
+        <w:t>backups</w:t>
+      </w:r>
+      <w:r>
+        <w:rPr/>
+        <w:t xml:space="preserve"> folder and put today's date in the name (e.g. </w:t>
+      </w:r>
+      <w:r>
+        <w:rPr>
+          <w:rStyle w:val="SourceText"/>
+        </w:rPr>
+        <w:t>long-term-game-sales — 2026-07-12.html</w:t>
+      </w:r>
+      <w:r>
+        <w:rPr/>
+        <w:t xml:space="preserve">). It takes five seconds and means you can never lose a working game. This is your safety net — treat it as non-negotiable. </w:t>
       </w:r>
     </w:p>
     <w:p>
@@ -842,11 +930,11 @@
         <w:rPr>
           <w:rStyle w:val="Strong"/>
         </w:rPr>
-        <w:t>Copilot is your hands, the browser is your judge.</w:t>
-      </w:r>
-      <w:r>
-        <w:rPr/>
-        <w:t xml:space="preserve"> Whatever Copilot writes, YOU confirm it works by actually playing the game. </w:t>
+        <w:t>Small changes, tested immediately.</w:t>
+      </w:r>
+      <w:r>
+        <w:rPr/>
+        <w:t xml:space="preserve"> Change one thing, save, refresh the browser, play it. Never batch up ten edits and hope. </w:t>
       </w:r>
     </w:p>
     <w:p>
@@ -870,31 +958,11 @@
         <w:rPr>
           <w:rStyle w:val="Strong"/>
         </w:rPr>
-        <w:t>Never edit below the "vendored" line.</w:t>
-      </w:r>
-      <w:r>
-        <w:rPr/>
-        <w:t xml:space="preserve"> Near the top of each game file there are two giant walls of unreadable compressed code labeled </w:t>
-      </w:r>
-      <w:r>
-        <w:rPr>
-          <w:rStyle w:val="SourceText"/>
-        </w:rPr>
-        <w:t>Chart.js</w:t>
-      </w:r>
-      <w:r>
-        <w:rPr/>
-        <w:t xml:space="preserve"> and </w:t>
-      </w:r>
-      <w:r>
-        <w:rPr>
-          <w:rStyle w:val="SourceText"/>
-        </w:rPr>
-        <w:t>html2canvas</w:t>
-      </w:r>
-      <w:r>
-        <w:rPr/>
-        <w:t xml:space="preserve"> (they draw the charts and make the share image). They are someone else's library, pasted in so the game works offline. Scroll past them; never touch them. </w:t>
+        <w:t>Copilot is your hands, the browser is your judge.</w:t>
+      </w:r>
+      <w:r>
+        <w:rPr/>
+        <w:t xml:space="preserve"> Whatever Copilot writes, YOU confirm it works by actually playing the game. </w:t>
       </w:r>
     </w:p>
     <w:p>
@@ -918,11 +986,31 @@
         <w:rPr>
           <w:rStyle w:val="Strong"/>
         </w:rPr>
-        <w:t>Don't weaken the legal text.</w:t>
-      </w:r>
-      <w:r>
-        <w:rPr/>
-        <w:t xml:space="preserve"> Every screen has disclaimers ("Illustrative… past performance…"). Compliance depends on them. You can fix a typo; you cannot delete or soften them without a compliance conversation. </w:t>
+        <w:t>Never edit below the "vendored" line.</w:t>
+      </w:r>
+      <w:r>
+        <w:rPr/>
+        <w:t xml:space="preserve"> Near the top of each game file there are two giant walls of unreadable compressed code labeled </w:t>
+      </w:r>
+      <w:r>
+        <w:rPr>
+          <w:rStyle w:val="SourceText"/>
+        </w:rPr>
+        <w:t>Chart.js</w:t>
+      </w:r>
+      <w:r>
+        <w:rPr/>
+        <w:t xml:space="preserve"> and </w:t>
+      </w:r>
+      <w:r>
+        <w:rPr>
+          <w:rStyle w:val="SourceText"/>
+        </w:rPr>
+        <w:t>html2canvas</w:t>
+      </w:r>
+      <w:r>
+        <w:rPr/>
+        <w:t xml:space="preserve"> (they draw the charts and make the share image). They are someone else's library, pasted in so the game works offline. Scroll past them; never touch them. </w:t>
       </w:r>
     </w:p>
     <w:p>
@@ -937,6 +1025,7 @@
           <w:tab w:val="left" w:pos="809" w:leader="none"/>
         </w:tabs>
         <w:bidi w:val="0"/>
+        <w:spacing w:before="100" w:after="0"/>
         <w:ind w:hanging="283" w:left="809"/>
         <w:jc w:val="left"/>
         <w:rPr/>
@@ -945,6 +1034,33 @@
         <w:rPr>
           <w:rStyle w:val="Strong"/>
         </w:rPr>
+        <w:t>Don't weaken the legal text.</w:t>
+      </w:r>
+      <w:r>
+        <w:rPr/>
+        <w:t xml:space="preserve"> Every screen has disclaimers ("Illustrative… past performance…"). Compliance depends on them. You can fix a typo; you cannot delete or soften them without a compliance conversation. </w:t>
+      </w:r>
+    </w:p>
+    <w:p>
+      <w:pPr>
+        <w:pStyle w:val="BodyText"/>
+        <w:numPr>
+          <w:ilvl w:val="0"/>
+          <w:numId w:val="1"/>
+        </w:numPr>
+        <w:tabs>
+          <w:tab w:val="clear" w:pos="1134"/>
+          <w:tab w:val="left" w:pos="809" w:leader="none"/>
+        </w:tabs>
+        <w:bidi w:val="0"/>
+        <w:ind w:hanging="283" w:left="809"/>
+        <w:jc w:val="left"/>
+        <w:rPr/>
+      </w:pPr>
+      <w:r>
+        <w:rPr>
+          <w:rStyle w:val="Strong"/>
+        </w:rPr>
         <w:t>When in doubt, undo.</w:t>
       </w:r>
       <w:r>
@@ -959,7 +1075,7 @@
       </w:r>
       <w:r>
         <w:rPr/>
-        <w:t xml:space="preserve"> undoes typing. The Source Control panel can discard everything back to the last saved version (Section 9). You cannot permanently break anything that has been committed to GitHub. </w:t>
+        <w:t xml:space="preserve"> undoes typing. And if a file is truly mangled, delete it and restore today's backup copy (rule 1). </w:t>
       </w:r>
     </w:p>
     <w:p>
@@ -1024,27 +1140,7 @@
       </w:r>
       <w:r>
         <w:rPr/>
-        <w:t xml:space="preserve"> → pick the </w:t>
-      </w:r>
-      <w:r>
-        <w:rPr>
-          <w:rStyle w:val="SourceText"/>
-        </w:rPr>
-        <w:t>decisionframework</w:t>
-      </w:r>
-      <w:r>
-        <w:rPr/>
-        <w:t xml:space="preserve"> folder (clone it from GitHub first if you haven't: in VS Code press </w:t>
-      </w:r>
-      <w:r>
-        <w:rPr>
-          <w:rStyle w:val="SourceText"/>
-        </w:rPr>
-        <w:t>Ctrl+Shift+P</w:t>
-      </w:r>
-      <w:r>
-        <w:rPr/>
-        <w:t xml:space="preserve">, type "Git: Clone", paste the repo address). </w:t>
+        <w:t xml:space="preserve"> → pick the project folder. </w:t>
       </w:r>
     </w:p>
     <w:p>
@@ -1066,7 +1162,7 @@
       </w:pPr>
       <w:r>
         <w:rPr/>
-        <w:t xml:space="preserve">Click a game file in the left sidebar to open it. </w:t>
+        <w:t xml:space="preserve">Make your dated backup copy (rule 1). </w:t>
       </w:r>
     </w:p>
     <w:p>
@@ -1088,17 +1184,7 @@
       </w:pPr>
       <w:r>
         <w:rPr/>
-        <w:t xml:space="preserve">To </w:t>
-      </w:r>
-      <w:r>
-        <w:rPr>
-          <w:rStyle w:val="Strong"/>
-        </w:rPr>
-        <w:t>see the game</w:t>
-      </w:r>
-      <w:r>
-        <w:rPr/>
-        <w:t xml:space="preserve">: find the file in Windows Explorer / Finder and double-click it — it opens in your browser. Keep that tab open. </w:t>
+        <w:t xml:space="preserve">Click a game file in the left sidebar to open it. </w:t>
       </w:r>
     </w:p>
     <w:p>
@@ -1113,12 +1199,44 @@
           <w:tab w:val="left" w:pos="809" w:leader="none"/>
         </w:tabs>
         <w:bidi w:val="0"/>
+        <w:spacing w:before="100" w:after="0"/>
         <w:ind w:hanging="283" w:left="809"/>
         <w:jc w:val="left"/>
         <w:rPr/>
       </w:pPr>
       <w:r>
         <w:rPr/>
+        <w:t xml:space="preserve">To </w:t>
+      </w:r>
+      <w:r>
+        <w:rPr>
+          <w:rStyle w:val="Strong"/>
+        </w:rPr>
+        <w:t>see the game</w:t>
+      </w:r>
+      <w:r>
+        <w:rPr/>
+        <w:t xml:space="preserve">: find the file in Windows Explorer / Finder and double-click it — it opens in your browser. Keep that tab open. </w:t>
+      </w:r>
+    </w:p>
+    <w:p>
+      <w:pPr>
+        <w:pStyle w:val="BodyText"/>
+        <w:numPr>
+          <w:ilvl w:val="0"/>
+          <w:numId w:val="2"/>
+        </w:numPr>
+        <w:tabs>
+          <w:tab w:val="clear" w:pos="1134"/>
+          <w:tab w:val="left" w:pos="809" w:leader="none"/>
+        </w:tabs>
+        <w:bidi w:val="0"/>
+        <w:ind w:hanging="283" w:left="809"/>
+        <w:jc w:val="left"/>
+        <w:rPr/>
+      </w:pPr>
+      <w:r>
+        <w:rPr/>
         <w:t xml:space="preserve">Your loop is: </w:t>
       </w:r>
       <w:r>
@@ -1295,8 +1413,6 @@
       <w:r>
         <w:rPr>
           <w:rStyle w:val="Emphasis"/>
-          <w:i/>
-          <w:iCs/>
         </w:rPr>
         <w:t>"Change this headline to 'Could you have held your nerve?' — keep all the HTML tags exactly as they are."</w:t>
       </w:r>
@@ -1311,8 +1427,6 @@
       <w:r>
         <w:rPr>
           <w:rStyle w:val="Emphasis"/>
-          <w:i/>
-          <w:iCs/>
         </w:rPr>
         <w:t>"In this scenario object, rewrite the 'story' text to mention rising oil prices. Don't change any of the field names or the month."</w:t>
       </w:r>
@@ -1327,8 +1441,6 @@
       <w:r>
         <w:rPr>
           <w:rStyle w:val="Emphasis"/>
-          <w:i/>
-          <w:iCs/>
         </w:rPr>
         <w:t>"Make this button's background the brand navy (--navy) instead of teal."</w:t>
       </w:r>
@@ -1361,8 +1473,6 @@
       <w:r>
         <w:rPr>
           <w:rStyle w:val="Emphasis"/>
-          <w:i/>
-          <w:iCs/>
         </w:rPr>
         <w:t>"This is a single self-contained HTML file. Don't add any external libraries, links to the internet, or new files. Keep the existing style. Make the smallest change that does this: …"</w:t>
       </w:r>
@@ -1474,7 +1584,7 @@
             <w:pPr>
               <w:pStyle w:val="TableHeading"/>
               <w:suppressLineNumbers/>
-              <w:shd w:fill="083469" w:val="clear"/>
+              <w:shd w:fill="008074" w:val="clear"/>
               <w:bidi w:val="0"/>
               <w:spacing w:before="100" w:after="100"/>
               <w:jc w:val="left"/>
@@ -1496,7 +1606,7 @@
             <w:pPr>
               <w:pStyle w:val="TableHeading"/>
               <w:suppressLineNumbers/>
-              <w:shd w:fill="083469" w:val="clear"/>
+              <w:shd w:fill="008074" w:val="clear"/>
               <w:bidi w:val="0"/>
               <w:spacing w:before="100" w:after="100"/>
               <w:jc w:val="left"/>
@@ -1518,7 +1628,7 @@
             <w:pPr>
               <w:pStyle w:val="TableHeading"/>
               <w:suppressLineNumbers/>
-              <w:shd w:fill="083469" w:val="clear"/>
+              <w:shd w:fill="008074" w:val="clear"/>
               <w:bidi w:val="0"/>
               <w:spacing w:before="100" w:after="100"/>
               <w:jc w:val="left"/>
@@ -2337,7 +2447,7 @@
             </w:pPr>
             <w:r>
               <w:rPr/>
-              <w:t>Rule 4 applies</w:t>
+              <w:t>Rule 5 applies</w:t>
             </w:r>
           </w:p>
         </w:tc>
@@ -2934,169 +3044,7 @@
       </w:r>
       <w:r>
         <w:rPr/>
-        <w:t xml:space="preserve"> §1.1. The rules: - If compliance/data ever supplies the </w:t>
-      </w:r>
-      <w:r>
-        <w:rPr>
-          <w:rStyle w:val="Strong"/>
-        </w:rPr>
-        <w:t>real verified monthly series</w:t>
-      </w:r>
-      <w:r>
-        <w:rPr/>
-        <w:t xml:space="preserve">, replace the </w:t>
-      </w:r>
-      <w:r>
-        <w:rPr>
-          <w:rStyle w:val="SourceText"/>
-        </w:rPr>
-        <w:t>AMBAL_NET_2020</w:t>
-      </w:r>
-      <w:r>
-        <w:rPr/>
-        <w:t xml:space="preserve"> array with it (Copilot prompt: </w:t>
-      </w:r>
-      <w:r>
-        <w:rPr>
-          <w:rStyle w:val="Emphasis"/>
-        </w:rPr>
-        <w:t>"Replace the values in AMBAL_NET_2020 with this list, keeping the same format: …"</w:t>
-      </w:r>
-      <w:r>
-        <w:rPr/>
-        <w:t xml:space="preserve">), and then delete/soften the "approximated" wording in the fund note and bottom disclaimer — search </w:t>
-      </w:r>
-      <w:r>
-        <w:rPr>
-          <w:rStyle w:val="SourceText"/>
-        </w:rPr>
-        <w:t>approximat</w:t>
-      </w:r>
-      <w:r>
-        <w:rPr/>
-        <w:t xml:space="preserve"> to find all of it. - To hide the line entirely (e.g. compliance says pause), set </w:t>
-      </w:r>
-      <w:r>
-        <w:rPr>
-          <w:rStyle w:val="SourceText"/>
-        </w:rPr>
-        <w:t>FUND_LINE_ENABLED = false</w:t>
-      </w:r>
-      <w:r>
-        <w:rPr/>
-        <w:t>. The note under the chart auto-switches to a "pending verification" message. That's the whole off-switch. - Never "improve" the fund's numbers by hand. Every figure must trace to a published source.</w:t>
-      </w:r>
-    </w:p>
-    <w:p>
-      <w:pPr>
-        <w:pStyle w:val="Heading3"/>
-        <w:bidi w:val="0"/>
-        <w:jc w:val="left"/>
-        <w:rPr/>
-      </w:pPr>
-      <w:r>
-        <w:rPr/>
-        <w:t>7.6 Change the brand colors</w:t>
-      </w:r>
-    </w:p>
-    <w:p>
-      <w:pPr>
-        <w:pStyle w:val="BodyText"/>
-        <w:bidi w:val="0"/>
-        <w:jc w:val="left"/>
-        <w:rPr/>
-      </w:pPr>
-      <w:r>
-        <w:rPr/>
-        <w:t xml:space="preserve">Search </w:t>
-      </w:r>
-      <w:r>
-        <w:rPr>
-          <w:rStyle w:val="SourceText"/>
-        </w:rPr>
-        <w:t>:root</w:t>
-      </w:r>
-      <w:r>
-        <w:rPr/>
-        <w:t xml:space="preserve"> (near the top, in the style section). You'll see the palette: </w:t>
-      </w:r>
-      <w:r>
-        <w:rPr>
-          <w:rStyle w:val="SourceText"/>
-        </w:rPr>
-        <w:t>--navy: #083469</w:t>
-      </w:r>
-      <w:r>
-        <w:rPr/>
-        <w:t xml:space="preserve">, </w:t>
-      </w:r>
-      <w:r>
-        <w:rPr>
-          <w:rStyle w:val="SourceText"/>
-        </w:rPr>
-        <w:t>--accent: #008074</w:t>
-      </w:r>
-      <w:r>
-        <w:rPr/>
-        <w:t xml:space="preserve"> (teal), etc. Change the color codes here and the whole game follows. Test afterwards — especially text readability on the dark reveal cards.</w:t>
-      </w:r>
-    </w:p>
-    <w:p>
-      <w:pPr>
-        <w:pStyle w:val="Heading3"/>
-        <w:bidi w:val="0"/>
-        <w:jc w:val="left"/>
-        <w:rPr/>
-      </w:pPr>
-      <w:r>
-        <w:rPr/>
-        <w:t>7.7 Live Room: the service address ⚠</w:t>
-      </w:r>
-    </w:p>
-    <w:p>
-      <w:pPr>
-        <w:pStyle w:val="BodyText"/>
-        <w:bidi w:val="0"/>
-        <w:jc w:val="left"/>
-        <w:rPr/>
-      </w:pPr>
-      <w:r>
-        <w:rPr/>
-        <w:t xml:space="preserve">Search </w:t>
-      </w:r>
-      <w:r>
-        <w:rPr>
-          <w:rStyle w:val="SourceText"/>
-        </w:rPr>
-        <w:t>const LIVE_BACKEND</w:t>
-      </w:r>
-      <w:r>
-        <w:rPr/>
-        <w:t xml:space="preserve"> in </w:t>
-      </w:r>
-      <w:r>
-        <w:rPr>
-          <w:rStyle w:val="SourceText"/>
-        </w:rPr>
-        <w:t>long-term-game-live.html</w:t>
-      </w:r>
-      <w:r>
-        <w:rPr/>
-        <w:t>. It looks like:</w:t>
-      </w:r>
-    </w:p>
-    <w:p>
-      <w:pPr>
-        <w:pStyle w:val="PreformattedText"/>
-        <w:bidi w:val="0"/>
-        <w:jc w:val="left"/>
-        <w:rPr/>
-      </w:pPr>
-      <w:r>
-        <w:rPr>
-          <w:rStyle w:val="SourceText"/>
-        </w:rPr>
-        <w:t>const LIVE_BACKEND = { databaseURL: "https://…firebasedatabase.app" };</w:t>
+        <w:t xml:space="preserve"> §1.1. The rules:</w:t>
       </w:r>
     </w:p>
     <w:p>
@@ -3118,7 +3066,47 @@
       </w:pPr>
       <w:r>
         <w:rPr/>
-        <w:t xml:space="preserve">That address is the Firebase "switchboard" that passes votes from phones to the big screen. Replace the address only if you set up a new Firebase Realtime Database (or an IT-hosted relay). </w:t>
+        <w:t xml:space="preserve">If compliance/data ever supplies the </w:t>
+      </w:r>
+      <w:r>
+        <w:rPr>
+          <w:rStyle w:val="Strong"/>
+        </w:rPr>
+        <w:t>real verified monthly series</w:t>
+      </w:r>
+      <w:r>
+        <w:rPr/>
+        <w:t xml:space="preserve">, replace the </w:t>
+      </w:r>
+      <w:r>
+        <w:rPr>
+          <w:rStyle w:val="SourceText"/>
+        </w:rPr>
+        <w:t>AMBAL_NET_2020</w:t>
+      </w:r>
+      <w:r>
+        <w:rPr/>
+        <w:t xml:space="preserve"> array with it (Copilot prompt: </w:t>
+      </w:r>
+      <w:r>
+        <w:rPr>
+          <w:rStyle w:val="Emphasis"/>
+        </w:rPr>
+        <w:t>"Replace the values in AMBAL_NET_2020 with this list, keeping the same format: …"</w:t>
+      </w:r>
+      <w:r>
+        <w:rPr/>
+        <w:t xml:space="preserve">), and then delete/soften the "approximated" wording in the fund note and bottom disclaimer — search </w:t>
+      </w:r>
+      <w:r>
+        <w:rPr>
+          <w:rStyle w:val="SourceText"/>
+        </w:rPr>
+        <w:t>approximat</w:t>
+      </w:r>
+      <w:r>
+        <w:rPr/>
+        <w:t xml:space="preserve"> to find all of it. </w:t>
       </w:r>
     </w:p>
     <w:p>
@@ -3139,24 +3127,18 @@
         <w:rPr/>
       </w:pPr>
       <w:r>
-        <w:rPr>
-          <w:rStyle w:val="Strong"/>
-        </w:rPr>
-        <w:t>Do not reformat this line.</w:t>
-      </w:r>
-      <w:r>
-        <w:rPr/>
-        <w:t xml:space="preserve"> The company-laptop servers in </w:t>
+        <w:rPr/>
+        <w:t xml:space="preserve">To hide the line entirely (e.g. compliance says pause), set </w:t>
       </w:r>
       <w:r>
         <w:rPr>
           <w:rStyle w:val="SourceText"/>
         </w:rPr>
-        <w:t>live-server/</w:t>
-      </w:r>
-      <w:r>
-        <w:rPr/>
-        <w:t xml:space="preserve"> find this exact line and auto-rewrite it when they serve the page. Change only the address between the quotes; leave the shape of the line alone. </w:t>
+        <w:t>FUND_LINE_ENABLED = false</w:t>
+      </w:r>
+      <w:r>
+        <w:rPr/>
+        <w:t xml:space="preserve">. The note under the chart auto-switches to a "pending verification" message. That's the whole off-switch. </w:t>
       </w:r>
     </w:p>
     <w:p>
@@ -3177,488 +3159,119 @@
       </w:pPr>
       <w:r>
         <w:rPr/>
-        <w:t xml:space="preserve">Everything about running events (company laptops, hotspots, what to ask IT) is in </w:t>
+        <w:t xml:space="preserve">Never "improve" the fund's numbers by hand. Every figure must trace to a published source. </w:t>
+      </w:r>
+    </w:p>
+    <w:p>
+      <w:pPr>
+        <w:pStyle w:val="Heading3"/>
+        <w:bidi w:val="0"/>
+        <w:jc w:val="left"/>
+        <w:rPr/>
+      </w:pPr>
+      <w:r>
+        <w:rPr/>
+        <w:t>7.6 Change the brand colors</w:t>
+      </w:r>
+    </w:p>
+    <w:p>
+      <w:pPr>
+        <w:pStyle w:val="BodyText"/>
+        <w:bidi w:val="0"/>
+        <w:jc w:val="left"/>
+        <w:rPr/>
+      </w:pPr>
+      <w:r>
+        <w:rPr/>
+        <w:t xml:space="preserve">Search </w:t>
       </w:r>
       <w:r>
         <w:rPr>
           <w:rStyle w:val="SourceText"/>
         </w:rPr>
-        <w:t>live-server/README.md</w:t>
-      </w:r>
-      <w:r>
-        <w:rPr/>
-        <w:t xml:space="preserve"> — written for non-technical readers. </w:t>
-      </w:r>
-    </w:p>
-    <w:p>
-      <w:pPr>
-        <w:pStyle w:val="HorizontalLine"/>
-        <w:bidi w:val="0"/>
-        <w:jc w:val="left"/>
-        <w:rPr/>
-      </w:pPr>
-      <w:r>
-        <w:rPr/>
-      </w:r>
-    </w:p>
-    <w:p>
-      <w:pPr>
-        <w:pStyle w:val="Heading2"/>
-        <w:bidi w:val="0"/>
-        <w:jc w:val="left"/>
-        <w:rPr/>
-      </w:pPr>
-      <w:r>
-        <w:rPr/>
-        <w:t>8 · Test before you publish (10 minutes)</w:t>
-      </w:r>
-    </w:p>
-    <w:p>
-      <w:pPr>
-        <w:pStyle w:val="BodyText"/>
-        <w:bidi w:val="0"/>
-        <w:jc w:val="left"/>
-        <w:rPr/>
-      </w:pPr>
-      <w:r>
-        <w:rPr/>
-        <w:t>After ANY change, play the changed game start to finish. Before publishing, check these specifically — they're the invariants that have caught real bugs:</w:t>
-      </w:r>
-    </w:p>
-    <w:p>
-      <w:pPr>
-        <w:pStyle w:val="BodyText"/>
-        <w:bidi w:val="0"/>
-        <w:jc w:val="left"/>
-        <w:rPr/>
-      </w:pPr>
-      <w:r>
-        <w:rPr>
-          <w:rStyle w:val="Strong"/>
-        </w:rPr>
-        <w:t>Solo games (Learning &amp; Sales):</w:t>
-      </w:r>
-      <w:r>
-        <w:rPr/>
-        <w:t xml:space="preserve"> - [ ] Portfolio starts at exactly </w:t>
-      </w:r>
-      <w:r>
-        <w:rPr>
-          <w:rStyle w:val="Strong"/>
-        </w:rPr>
-        <w:t>$50,000</w:t>
-      </w:r>
-      <w:r>
-        <w:rPr/>
-        <w:t xml:space="preserve"> at the first moment. - [ ] Play a round pressing </w:t>
-      </w:r>
-      <w:r>
-        <w:rPr>
-          <w:rStyle w:val="Strong"/>
-        </w:rPr>
-        <w:t>Hold every time</w:t>
-      </w:r>
-      <w:r>
-        <w:rPr/>
-        <w:t xml:space="preserve"> → at the reveal, "Your choices" and "Stayed invested" must be </w:t>
-      </w:r>
-      <w:r>
-        <w:rPr>
-          <w:rStyle w:val="Strong"/>
-        </w:rPr>
-        <w:t>identical to the dollar</w:t>
-      </w:r>
-      <w:r>
-        <w:rPr/>
-        <w:t xml:space="preserve">. If they differ, something broke — undo your change. - [ ] Click every era tab (1973, 1987, 2000, 2008, 2011, 2015–18) and back to "Your 2020" — the whole section should swap cleanly each way. - [ ] "Play again" lets you pick a different risk profile. - [ ] Sales only: fund line appears on the 60/40 profile, disappears on era views, and the 70/30 profile shows the "reselect Balanced" note. - [ ] Make the browser window phone-narrow (or press </w:t>
+        <w:t>:root</w:t>
+      </w:r>
+      <w:r>
+        <w:rPr/>
+        <w:t xml:space="preserve"> (near the top, in the style section). You'll see the palette: </w:t>
       </w:r>
       <w:r>
         <w:rPr>
           <w:rStyle w:val="SourceText"/>
         </w:rPr>
-        <w:t>F12</w:t>
-      </w:r>
-      <w:r>
-        <w:rPr/>
-        <w:t xml:space="preserve"> → phone icon) — nothing should overflow sideways.</w:t>
-      </w:r>
-    </w:p>
-    <w:p>
-      <w:pPr>
-        <w:pStyle w:val="BodyText"/>
-        <w:bidi w:val="0"/>
-        <w:jc w:val="left"/>
-        <w:rPr/>
-      </w:pPr>
-      <w:r>
-        <w:rPr>
-          <w:rStyle w:val="Strong"/>
-        </w:rPr>
-        <w:t>Live Room:</w:t>
-      </w:r>
-      <w:r>
-        <w:rPr/>
-        <w:t xml:space="preserve"> - [ ] Open </w:t>
+        <w:t>--navy: #083469</w:t>
+      </w:r>
+      <w:r>
+        <w:rPr/>
+        <w:t xml:space="preserve">, </w:t>
       </w:r>
       <w:r>
         <w:rPr>
           <w:rStyle w:val="SourceText"/>
         </w:rPr>
-        <w:t>?live=host</w:t>
-      </w:r>
-      <w:r>
-        <w:rPr/>
-        <w:t xml:space="preserve"> in one window → room code appears. - [ ] Join from a second window (or your phone) with that code → vote → the phone should NOT show the outcome until the host presses </w:t>
-      </w:r>
-      <w:r>
-        <w:rPr>
-          <w:rStyle w:val="Strong"/>
-        </w:rPr>
-        <w:t>"Reveal what happened"</w:t>
-      </w:r>
-      <w:r>
-        <w:rPr/>
-        <w:t>. - [ ] Leaderboard appears at the end.</w:t>
-      </w:r>
-    </w:p>
-    <w:p>
-      <w:pPr>
-        <w:pStyle w:val="HorizontalLine"/>
-        <w:bidi w:val="0"/>
-        <w:jc w:val="left"/>
-        <w:rPr/>
-      </w:pPr>
-      <w:r>
-        <w:rPr/>
-      </w:r>
-    </w:p>
-    <w:p>
-      <w:pPr>
-        <w:pStyle w:val="Heading2"/>
-        <w:bidi w:val="0"/>
-        <w:jc w:val="left"/>
-        <w:rPr/>
-      </w:pPr>
-      <w:r>
-        <w:rPr/>
-        <w:t>9 · Saving and publishing (GitHub, in plain English)</w:t>
-      </w:r>
-    </w:p>
-    <w:p>
-      <w:pPr>
-        <w:pStyle w:val="BodyText"/>
-        <w:bidi w:val="0"/>
-        <w:jc w:val="left"/>
-        <w:rPr/>
-      </w:pPr>
-      <w:r>
-        <w:rPr/>
-        <w:t xml:space="preserve">Think of it as two shelves: - </w:t>
+        <w:t>--accent: #008074</w:t>
+      </w:r>
+      <w:r>
+        <w:rPr/>
+        <w:t xml:space="preserve"> (teal), etc. Change the color codes here and the whole game follows. Test afterwards — especially text readability on the dark reveal cards.</w:t>
+      </w:r>
+    </w:p>
+    <w:p>
+      <w:pPr>
+        <w:pStyle w:val="Heading3"/>
+        <w:bidi w:val="0"/>
+        <w:jc w:val="left"/>
+        <w:rPr/>
+      </w:pPr>
+      <w:r>
+        <w:rPr/>
+        <w:t>7.7 Live Room: the service address ⚠</w:t>
+      </w:r>
+    </w:p>
+    <w:p>
+      <w:pPr>
+        <w:pStyle w:val="BodyText"/>
+        <w:bidi w:val="0"/>
+        <w:jc w:val="left"/>
+        <w:rPr/>
+      </w:pPr>
+      <w:r>
+        <w:rPr/>
+        <w:t xml:space="preserve">Search </w:t>
       </w:r>
       <w:r>
         <w:rPr>
           <w:rStyle w:val="SourceText"/>
         </w:rPr>
-        <w:t>main</w:t>
-      </w:r>
-      <w:r>
-        <w:rPr>
-          <w:rStyle w:val="Strong"/>
-        </w:rPr>
-        <w:t xml:space="preserve"> branch</w:t>
-      </w:r>
-      <w:r>
-        <w:rPr/>
-        <w:t xml:space="preserve"> = the master copy of the files. - </w:t>
+        <w:t>const LIVE_BACKEND</w:t>
+      </w:r>
+      <w:r>
+        <w:rPr/>
+        <w:t xml:space="preserve"> in </w:t>
       </w:r>
       <w:r>
         <w:rPr>
           <w:rStyle w:val="SourceText"/>
         </w:rPr>
-        <w:t>gh-pages</w:t>
-      </w:r>
-      <w:r>
-        <w:rPr>
-          <w:rStyle w:val="Strong"/>
-        </w:rPr>
-        <w:t xml:space="preserve"> branch</w:t>
-      </w:r>
-      <w:r>
-        <w:rPr/>
-        <w:t xml:space="preserve"> = the live public website. Whatever sits on this shelf IS what the world sees at the site address.</w:t>
-      </w:r>
-    </w:p>
-    <w:p>
-      <w:pPr>
-        <w:pStyle w:val="BodyText"/>
-        <w:bidi w:val="0"/>
-        <w:jc w:val="left"/>
-        <w:rPr/>
-      </w:pPr>
-      <w:r>
-        <w:rPr>
-          <w:rStyle w:val="Strong"/>
-        </w:rPr>
-        <w:t>Saving your work (the master copy).</w:t>
-      </w:r>
-      <w:r>
-        <w:rPr/>
-        <w:t xml:space="preserve"> In VS Code, click the </w:t>
-      </w:r>
-      <w:r>
-        <w:rPr>
-          <w:rStyle w:val="Strong"/>
-        </w:rPr>
-        <w:t>Source Control</w:t>
-      </w:r>
-      <w:r>
-        <w:rPr/>
-        <w:t xml:space="preserve"> icon (left bar, branching-lines symbol). You'll see your changed files. Hover a file to see the diff (what you changed). Then: 1. Click </w:t>
-      </w:r>
-      <w:r>
-        <w:rPr>
-          <w:rStyle w:val="Strong"/>
-        </w:rPr>
-        <w:t>+</w:t>
-      </w:r>
-      <w:r>
-        <w:rPr/>
-        <w:t xml:space="preserve"> next to the file (this "stages" it — puts it in the box). 2. Type a one-line description of what you changed. 3. Click </w:t>
-      </w:r>
-      <w:r>
-        <w:rPr>
-          <w:rStyle w:val="Strong"/>
-        </w:rPr>
-        <w:t>Commit</w:t>
-      </w:r>
-      <w:r>
-        <w:rPr/>
-        <w:t xml:space="preserve">, then </w:t>
-      </w:r>
-      <w:r>
-        <w:rPr>
-          <w:rStyle w:val="Strong"/>
-        </w:rPr>
-        <w:t>Sync Changes</w:t>
-      </w:r>
-      <w:r>
-        <w:rPr/>
-        <w:t xml:space="preserve"> (pushes it to GitHub).</w:t>
-      </w:r>
-    </w:p>
-    <w:p>
-      <w:pPr>
-        <w:pStyle w:val="BodyText"/>
-        <w:bidi w:val="0"/>
-        <w:jc w:val="left"/>
-        <w:rPr/>
-      </w:pPr>
-      <w:r>
-        <w:rPr/>
-        <w:t>That's it. Every commit is a permanent restore point — this is your backup system, which is why you commit often.</w:t>
-      </w:r>
-    </w:p>
-    <w:p>
-      <w:pPr>
-        <w:pStyle w:val="BodyText"/>
-        <w:bidi w:val="0"/>
-        <w:jc w:val="left"/>
-        <w:rPr/>
-      </w:pPr>
-      <w:r>
-        <w:rPr>
-          <w:rStyle w:val="Strong"/>
-        </w:rPr>
-        <w:t>Publishing to the live site.</w:t>
-      </w:r>
-      <w:r>
-        <w:rPr/>
-        <w:t xml:space="preserve"> The simplest reliable way is the GitHub website: 1. Go to the repo on github.com and switch the branch dropdown (top-left of the file list) to </w:t>
-      </w:r>
+        <w:t>long-term-game-live.html</w:t>
+      </w:r>
+      <w:r>
+        <w:rPr/>
+        <w:t>. It looks like:</w:t>
+      </w:r>
+    </w:p>
+    <w:p>
+      <w:pPr>
+        <w:pStyle w:val="PreformattedText"/>
+        <w:bidi w:val="0"/>
+        <w:jc w:val="left"/>
+        <w:rPr/>
+      </w:pPr>
       <w:r>
         <w:rPr>
           <w:rStyle w:val="SourceText"/>
         </w:rPr>
-        <w:t>gh-pages</w:t>
-      </w:r>
-      <w:r>
-        <w:rPr/>
-        <w:t xml:space="preserve">. 2. Click </w:t>
-      </w:r>
-      <w:r>
-        <w:rPr>
-          <w:rStyle w:val="Strong"/>
-        </w:rPr>
-        <w:t>Add file → Upload files</w:t>
-      </w:r>
-      <w:r>
-        <w:rPr/>
-        <w:t>, drag in the game file(s) you changed, and commit. Uploading a file with the same name replaces the old one. 3. Wait ~1 minute, then hard-refresh the public page (</w:t>
-      </w:r>
-      <w:r>
-        <w:rPr>
-          <w:rStyle w:val="SourceText"/>
-        </w:rPr>
-        <w:t>Ctrl+Shift+R</w:t>
-      </w:r>
-      <w:r>
-        <w:rPr/>
-        <w:t>).</w:t>
-      </w:r>
-    </w:p>
-    <w:p>
-      <w:pPr>
-        <w:pStyle w:val="BodyText"/>
-        <w:bidi w:val="0"/>
-        <w:jc w:val="left"/>
-        <w:rPr/>
-      </w:pPr>
-      <w:r>
-        <w:rPr/>
-        <w:t xml:space="preserve">Note: on </w:t>
-      </w:r>
-      <w:r>
-        <w:rPr>
-          <w:rStyle w:val="SourceText"/>
-        </w:rPr>
-        <w:t>gh-pages</w:t>
-      </w:r>
-      <w:r>
-        <w:rPr/>
-        <w:t xml:space="preserve"> the Live Room file is ALSO saved as </w:t>
-      </w:r>
-      <w:r>
-        <w:rPr>
-          <w:rStyle w:val="SourceText"/>
-        </w:rPr>
-        <w:t>index.html</w:t>
-      </w:r>
-      <w:r>
-        <w:rPr/>
-        <w:t xml:space="preserve"> (that's why it's the homepage). If you changed </w:t>
-      </w:r>
-      <w:r>
-        <w:rPr>
-          <w:rStyle w:val="SourceText"/>
-        </w:rPr>
-        <w:t>long-term-game-live.html</w:t>
-      </w:r>
-      <w:r>
-        <w:rPr/>
-        <w:t xml:space="preserve">, upload it twice — once as itself, and once renamed to </w:t>
-      </w:r>
-      <w:r>
-        <w:rPr>
-          <w:rStyle w:val="SourceText"/>
-        </w:rPr>
-        <w:t>index.html</w:t>
-      </w:r>
-      <w:r>
-        <w:rPr/>
-        <w:t>.</w:t>
-      </w:r>
-    </w:p>
-    <w:p>
-      <w:pPr>
-        <w:pStyle w:val="BodyText"/>
-        <w:bidi w:val="0"/>
-        <w:jc w:val="left"/>
-        <w:rPr/>
-      </w:pPr>
-      <w:r>
-        <w:rPr>
-          <w:rStyle w:val="Strong"/>
-        </w:rPr>
-        <w:t>Undo, at every level:</w:t>
-      </w:r>
-      <w:r>
-        <w:rPr/>
-        <w:t xml:space="preserve"> - Typing mistake → </w:t>
-      </w:r>
-      <w:r>
-        <w:rPr>
-          <w:rStyle w:val="SourceText"/>
-        </w:rPr>
-        <w:t>Ctrl+Z</w:t>
-      </w:r>
-      <w:r>
-        <w:rPr/>
-        <w:t xml:space="preserve">. - "I want to throw away everything since my last commit" → Source Control → right-click the file → </w:t>
-      </w:r>
-      <w:r>
-        <w:rPr>
-          <w:rStyle w:val="Strong"/>
-        </w:rPr>
-        <w:t>Discard Changes</w:t>
-      </w:r>
-      <w:r>
-        <w:rPr/>
-        <w:t xml:space="preserve">. - "I published something bad" → on github.com, open the file's </w:t>
-      </w:r>
-      <w:r>
-        <w:rPr>
-          <w:rStyle w:val="Strong"/>
-        </w:rPr>
-        <w:t>History</w:t>
-      </w:r>
-      <w:r>
-        <w:rPr/>
-        <w:t xml:space="preserve">, view the last good version, and re-upload that. (Or ask Copilot Chat: </w:t>
-      </w:r>
-      <w:r>
-        <w:rPr>
-          <w:rStyle w:val="Emphasis"/>
-        </w:rPr>
-        <w:t>"Show me the git commands to restore this file to the previous commit."</w:t>
-      </w:r>
-      <w:r>
-        <w:rPr/>
-        <w:t>)</w:t>
-      </w:r>
-    </w:p>
-    <w:p>
-      <w:pPr>
-        <w:pStyle w:val="HorizontalLine"/>
-        <w:bidi w:val="0"/>
-        <w:jc w:val="left"/>
-        <w:rPr/>
-      </w:pPr>
-      <w:r>
-        <w:rPr/>
-      </w:r>
-    </w:p>
-    <w:p>
-      <w:pPr>
-        <w:pStyle w:val="Heading2"/>
-        <w:bidi w:val="0"/>
-        <w:jc w:val="left"/>
-        <w:rPr/>
-      </w:pPr>
-      <w:r>
-        <w:rPr/>
-        <w:t>10 · The rules that outrank everything (compliance)</w:t>
-      </w:r>
-    </w:p>
-    <w:p>
-      <w:pPr>
-        <w:pStyle w:val="BodyText"/>
-        <w:bidi w:val="0"/>
-        <w:jc w:val="left"/>
-        <w:rPr/>
-      </w:pPr>
-      <w:r>
-        <w:rPr/>
-        <w:t xml:space="preserve">This is a Capital Group-branded prototype with real market data and real fund performance in it. It is currently </w:t>
-      </w:r>
-      <w:r>
-        <w:rPr>
-          <w:rStyle w:val="Strong"/>
-        </w:rPr>
-        <w:t>internal / pre-approval</w:t>
-      </w:r>
-      <w:r>
-        <w:rPr/>
-        <w:t>:</w:t>
+        <w:t>const LIVE_BACKEND = { databaseURL: "https://…firebasedatabase.app" };</w:t>
       </w:r>
     </w:p>
     <w:p>
@@ -3679,20 +3292,8 @@
         <w:rPr/>
       </w:pPr>
       <w:r>
-        <w:rPr>
-          <w:rStyle w:val="SourceText"/>
-        </w:rPr>
-        <w:t>VERIFICATION-CHECKLIST.md</w:t>
-      </w:r>
-      <w:r>
-        <w:rPr>
-          <w:rStyle w:val="Strong"/>
-        </w:rPr>
-        <w:t xml:space="preserve"> is the contract.</w:t>
-      </w:r>
-      <w:r>
-        <w:rPr/>
-        <w:t xml:space="preserve"> Nothing goes in front of a real client or external audience until the data verifications and the compliance/brand sign-offs in that file are done. If you change any number, record it there. </w:t>
+        <w:rPr/>
+        <w:t xml:space="preserve">That address is the online "switchboard" that passes votes from phones to the big screen. Replace the address only if you set up a new Firebase Realtime Database (or an IT-hosted relay). </w:t>
       </w:r>
     </w:p>
     <w:p>
@@ -3716,31 +3317,21 @@
         <w:rPr>
           <w:rStyle w:val="Strong"/>
         </w:rPr>
-        <w:t>The public demo site is temporary.</w:t>
-      </w:r>
-      <w:r>
-        <w:rPr/>
-        <w:t xml:space="preserve"> The recorded decision: it stays up for testing, and </w:t>
-      </w:r>
-      <w:r>
-        <w:rPr>
-          <w:rStyle w:val="Strong"/>
-        </w:rPr>
-        <w:t>must be taken down before the compliance review concludes</w:t>
-      </w:r>
-      <w:r>
-        <w:rPr/>
-        <w:t xml:space="preserve"> — delete the </w:t>
+        <w:t>Do not reformat this line.</w:t>
+      </w:r>
+      <w:r>
+        <w:rPr/>
+        <w:t xml:space="preserve"> The company-laptop servers in </w:t>
       </w:r>
       <w:r>
         <w:rPr>
           <w:rStyle w:val="SourceText"/>
         </w:rPr>
-        <w:t>gh-pages</w:t>
-      </w:r>
-      <w:r>
-        <w:rPr/>
-        <w:t xml:space="preserve"> branch on GitHub AND lock the Firebase database rules. Don't inherit this project and forget that. </w:t>
+        <w:t>live-server/</w:t>
+      </w:r>
+      <w:r>
+        <w:rPr/>
+        <w:t xml:space="preserve"> find this exact line and auto-rewrite it when they serve the page. Change only the address between the quotes; leave the shape of the line alone. </w:t>
       </w:r>
     </w:p>
     <w:p>
@@ -3755,70 +3346,72 @@
           <w:tab w:val="left" w:pos="809" w:leader="none"/>
         </w:tabs>
         <w:bidi w:val="0"/>
-        <w:spacing w:before="100" w:after="0"/>
         <w:ind w:hanging="283" w:left="809"/>
         <w:jc w:val="left"/>
         <w:rPr/>
       </w:pPr>
       <w:r>
+        <w:rPr/>
+        <w:t xml:space="preserve">Everything about running events (company laptops, hotspots, what to ask IT) is in </w:t>
+      </w:r>
+      <w:r>
+        <w:rPr>
+          <w:rStyle w:val="SourceText"/>
+        </w:rPr>
+        <w:t>live-server/README.md</w:t>
+      </w:r>
+      <w:r>
+        <w:rPr/>
+        <w:t xml:space="preserve"> — written for non-technical readers. </w:t>
+      </w:r>
+    </w:p>
+    <w:p>
+      <w:pPr>
+        <w:pStyle w:val="HorizontalLine"/>
+        <w:bidi w:val="0"/>
+        <w:jc w:val="left"/>
+        <w:rPr/>
+      </w:pPr>
+      <w:r>
+        <w:rPr/>
+      </w:r>
+    </w:p>
+    <w:p>
+      <w:pPr>
+        <w:pStyle w:val="Heading2"/>
+        <w:bidi w:val="0"/>
+        <w:jc w:val="left"/>
+        <w:rPr/>
+      </w:pPr>
+      <w:r>
+        <w:rPr/>
+        <w:t>8 · Test before you share it (10 minutes)</w:t>
+      </w:r>
+    </w:p>
+    <w:p>
+      <w:pPr>
+        <w:pStyle w:val="BodyText"/>
+        <w:bidi w:val="0"/>
+        <w:jc w:val="left"/>
+        <w:rPr/>
+      </w:pPr>
+      <w:r>
+        <w:rPr/>
+        <w:t>After ANY change, play the changed game start to finish. Before handing a file to anyone, check these specifically — they're the invariants that have caught real bugs:</w:t>
+      </w:r>
+    </w:p>
+    <w:p>
+      <w:pPr>
+        <w:pStyle w:val="BodyText"/>
+        <w:bidi w:val="0"/>
+        <w:jc w:val="left"/>
+        <w:rPr/>
+      </w:pPr>
+      <w:r>
         <w:rPr>
           <w:rStyle w:val="Strong"/>
         </w:rPr>
-        <w:t>Disclaimers stay.</w:t>
-      </w:r>
-      <w:r>
-        <w:rPr/>
-        <w:t xml:space="preserve"> (Rule 4 again, because it matters.) </w:t>
-      </w:r>
-    </w:p>
-    <w:p>
-      <w:pPr>
-        <w:pStyle w:val="BodyText"/>
-        <w:numPr>
-          <w:ilvl w:val="0"/>
-          <w:numId w:val="5"/>
-        </w:numPr>
-        <w:tabs>
-          <w:tab w:val="clear" w:pos="1134"/>
-          <w:tab w:val="left" w:pos="809" w:leader="none"/>
-        </w:tabs>
-        <w:bidi w:val="0"/>
-        <w:ind w:hanging="283" w:left="809"/>
-        <w:jc w:val="left"/>
-        <w:rPr/>
-      </w:pPr>
-      <w:r>
-        <w:rPr>
-          <w:rStyle w:val="Strong"/>
-        </w:rPr>
-        <w:t>The Live Room collects nothing but nicknames and votes</w:t>
-      </w:r>
-      <w:r>
-        <w:rPr/>
-        <w:t xml:space="preserve">, in throwaway rooms. Keep it that way — the moment someone suggests collecting emails through it, that's a new privacy conversation, not a Copilot prompt. </w:t>
-      </w:r>
-    </w:p>
-    <w:p>
-      <w:pPr>
-        <w:pStyle w:val="HorizontalLine"/>
-        <w:bidi w:val="0"/>
-        <w:jc w:val="left"/>
-        <w:rPr/>
-      </w:pPr>
-      <w:r>
-        <w:rPr/>
-      </w:r>
-    </w:p>
-    <w:p>
-      <w:pPr>
-        <w:pStyle w:val="Heading2"/>
-        <w:bidi w:val="0"/>
-        <w:jc w:val="left"/>
-        <w:rPr/>
-      </w:pPr>
-      <w:r>
-        <w:rPr/>
-        <w:t>11 · When something breaks and undo isn't enough</w:t>
+        <w:t>Solo games (Learning &amp; Sales):</w:t>
       </w:r>
     </w:p>
     <w:p>
@@ -3839,44 +3432,18 @@
         <w:rPr/>
       </w:pPr>
       <w:r>
+        <w:rPr/>
+        <w:t xml:space="preserve">Portfolio starts at exactly </w:t>
+      </w:r>
+      <w:r>
         <w:rPr>
           <w:rStyle w:val="Strong"/>
         </w:rPr>
-        <w:t>Blank page after an edit:</w:t>
-      </w:r>
-      <w:r>
-        <w:rPr/>
-        <w:t xml:space="preserve"> almost always a broken piece of JavaScript. Press </w:t>
-      </w:r>
-      <w:r>
-        <w:rPr>
-          <w:rStyle w:val="SourceText"/>
-        </w:rPr>
-        <w:t>F12</w:t>
-      </w:r>
-      <w:r>
-        <w:rPr/>
-        <w:t xml:space="preserve"> in the browser → </w:t>
-      </w:r>
-      <w:r>
-        <w:rPr>
-          <w:rStyle w:val="Strong"/>
-        </w:rPr>
-        <w:t>Console</w:t>
-      </w:r>
-      <w:r>
-        <w:rPr/>
-        <w:t xml:space="preserve"> tab → screenshot the red error → paste it to Copilot Chat with </w:t>
-      </w:r>
-      <w:r>
-        <w:rPr>
-          <w:rStyle w:val="Emphasis"/>
-        </w:rPr>
-        <w:t>"This single-file HTML game shows a blank page, here's the console error, here's the code near it — what's the smallest fix?"</w:t>
-      </w:r>
-      <w:r>
-        <w:rPr/>
-        <w:t xml:space="preserve"> </w:t>
+        <w:t>$50,000</w:t>
+      </w:r>
+      <w:r>
+        <w:rPr/>
+        <w:t xml:space="preserve"> at the first moment. </w:t>
       </w:r>
     </w:p>
     <w:p>
@@ -3897,14 +3464,28 @@
         <w:rPr/>
       </w:pPr>
       <w:r>
+        <w:rPr/>
+        <w:t xml:space="preserve">Play a round pressing </w:t>
+      </w:r>
+      <w:r>
         <w:rPr>
           <w:rStyle w:val="Strong"/>
         </w:rPr>
-        <w:t>Chart looks wrong / numbers seem off:</w:t>
-      </w:r>
-      <w:r>
-        <w:rPr/>
-        <w:t xml:space="preserve"> re-run the Section 8 checklist, especially the all-Hold tie. If the tie fails, your change touched game math — discard the change and re-approach with a narrower prompt. </w:t>
+        <w:t>Hold every time</w:t>
+      </w:r>
+      <w:r>
+        <w:rPr/>
+        <w:t xml:space="preserve"> → at the reveal, "Your choices" and "Stayed invested" must be </w:t>
+      </w:r>
+      <w:r>
+        <w:rPr>
+          <w:rStyle w:val="Strong"/>
+        </w:rPr>
+        <w:t>identical to the dollar</w:t>
+      </w:r>
+      <w:r>
+        <w:rPr/>
+        <w:t xml:space="preserve">. If they differ, something broke — restore your backup. </w:t>
       </w:r>
     </w:p>
     <w:p>
@@ -3925,24 +3506,8 @@
         <w:rPr/>
       </w:pPr>
       <w:r>
-        <w:rPr>
-          <w:rStyle w:val="Strong"/>
-        </w:rPr>
-        <w:t>Live Room won't connect:</w:t>
-      </w:r>
-      <w:r>
-        <w:rPr/>
-        <w:t xml:space="preserve"> it now fails loudly with an on-screen message after ~8 seconds instead of hanging. The message itself lists the likely causes (corporate network blocking, etc.). </w:t>
-      </w:r>
-      <w:r>
-        <w:rPr>
-          <w:rStyle w:val="SourceText"/>
-        </w:rPr>
-        <w:t>live-server/README.md</w:t>
-      </w:r>
-      <w:r>
-        <w:rPr/>
-        <w:t xml:space="preserve"> has the full plain-English troubleshooting list, including the phone-hotspot fallback for events. </w:t>
+        <w:rPr/>
+        <w:t xml:space="preserve">Click every era tab (1973, 1987, 2000, 2008, 2011, 2015–18) and back to "Your 2020" — the whole section should swap cleanly each way. </w:t>
       </w:r>
     </w:p>
     <w:p>
@@ -3957,19 +3522,591 @@
           <w:tab w:val="left" w:pos="809" w:leader="none"/>
         </w:tabs>
         <w:bidi w:val="0"/>
+        <w:spacing w:before="100" w:after="0"/>
         <w:ind w:hanging="283" w:left="809"/>
         <w:jc w:val="left"/>
         <w:rPr/>
       </w:pPr>
       <w:r>
+        <w:rPr/>
+        <w:t xml:space="preserve">"Play again" lets you pick a different risk profile. </w:t>
+      </w:r>
+    </w:p>
+    <w:p>
+      <w:pPr>
+        <w:pStyle w:val="BodyText"/>
+        <w:numPr>
+          <w:ilvl w:val="0"/>
+          <w:numId w:val="6"/>
+        </w:numPr>
+        <w:tabs>
+          <w:tab w:val="clear" w:pos="1134"/>
+          <w:tab w:val="left" w:pos="809" w:leader="none"/>
+        </w:tabs>
+        <w:bidi w:val="0"/>
+        <w:spacing w:before="100" w:after="0"/>
+        <w:ind w:hanging="283" w:left="809"/>
+        <w:jc w:val="left"/>
+        <w:rPr/>
+      </w:pPr>
+      <w:r>
+        <w:rPr/>
+        <w:t xml:space="preserve">Sales only: fund line appears on the 60/40 profile, disappears on era views, and the 70/30 profile shows the "reselect Balanced" note. </w:t>
+      </w:r>
+    </w:p>
+    <w:p>
+      <w:pPr>
+        <w:pStyle w:val="BodyText"/>
+        <w:numPr>
+          <w:ilvl w:val="0"/>
+          <w:numId w:val="6"/>
+        </w:numPr>
+        <w:tabs>
+          <w:tab w:val="clear" w:pos="1134"/>
+          <w:tab w:val="left" w:pos="809" w:leader="none"/>
+        </w:tabs>
+        <w:bidi w:val="0"/>
+        <w:ind w:hanging="283" w:left="809"/>
+        <w:jc w:val="left"/>
+        <w:rPr/>
+      </w:pPr>
+      <w:r>
+        <w:rPr/>
+        <w:t xml:space="preserve">Make the browser window phone-narrow (or press </w:t>
+      </w:r>
+      <w:r>
+        <w:rPr>
+          <w:rStyle w:val="SourceText"/>
+        </w:rPr>
+        <w:t>F12</w:t>
+      </w:r>
+      <w:r>
+        <w:rPr/>
+        <w:t xml:space="preserve"> → phone icon) — nothing should overflow sideways. </w:t>
+      </w:r>
+    </w:p>
+    <w:p>
+      <w:pPr>
+        <w:pStyle w:val="BodyText"/>
+        <w:bidi w:val="0"/>
+        <w:jc w:val="left"/>
+        <w:rPr/>
+      </w:pPr>
+      <w:r>
         <w:rPr>
           <w:rStyle w:val="Strong"/>
         </w:rPr>
+        <w:t>Live Room:</w:t>
+      </w:r>
+    </w:p>
+    <w:p>
+      <w:pPr>
+        <w:pStyle w:val="BodyText"/>
+        <w:numPr>
+          <w:ilvl w:val="0"/>
+          <w:numId w:val="7"/>
+        </w:numPr>
+        <w:tabs>
+          <w:tab w:val="clear" w:pos="1134"/>
+          <w:tab w:val="left" w:pos="809" w:leader="none"/>
+        </w:tabs>
+        <w:bidi w:val="0"/>
+        <w:spacing w:before="100" w:after="0"/>
+        <w:ind w:hanging="283" w:left="809"/>
+        <w:jc w:val="left"/>
+        <w:rPr/>
+      </w:pPr>
+      <w:r>
+        <w:rPr/>
+        <w:t xml:space="preserve">Open the game with </w:t>
+      </w:r>
+      <w:r>
+        <w:rPr>
+          <w:rStyle w:val="SourceText"/>
+        </w:rPr>
+        <w:t>?live=host</w:t>
+      </w:r>
+      <w:r>
+        <w:rPr/>
+        <w:t xml:space="preserve"> added to the address in one window → a room code appears. </w:t>
+      </w:r>
+    </w:p>
+    <w:p>
+      <w:pPr>
+        <w:pStyle w:val="BodyText"/>
+        <w:numPr>
+          <w:ilvl w:val="0"/>
+          <w:numId w:val="7"/>
+        </w:numPr>
+        <w:tabs>
+          <w:tab w:val="clear" w:pos="1134"/>
+          <w:tab w:val="left" w:pos="809" w:leader="none"/>
+        </w:tabs>
+        <w:bidi w:val="0"/>
+        <w:spacing w:before="100" w:after="0"/>
+        <w:ind w:hanging="283" w:left="809"/>
+        <w:jc w:val="left"/>
+        <w:rPr/>
+      </w:pPr>
+      <w:r>
+        <w:rPr/>
+        <w:t xml:space="preserve">Join from a second window (or your phone) with that code → vote → the phone should NOT show the outcome until the host presses </w:t>
+      </w:r>
+      <w:r>
+        <w:rPr>
+          <w:rStyle w:val="Strong"/>
+        </w:rPr>
+        <w:t>"Reveal what happened"</w:t>
+      </w:r>
+      <w:r>
+        <w:rPr/>
+        <w:t xml:space="preserve">. </w:t>
+      </w:r>
+    </w:p>
+    <w:p>
+      <w:pPr>
+        <w:pStyle w:val="BodyText"/>
+        <w:numPr>
+          <w:ilvl w:val="0"/>
+          <w:numId w:val="7"/>
+        </w:numPr>
+        <w:tabs>
+          <w:tab w:val="clear" w:pos="1134"/>
+          <w:tab w:val="left" w:pos="809" w:leader="none"/>
+        </w:tabs>
+        <w:bidi w:val="0"/>
+        <w:ind w:hanging="283" w:left="809"/>
+        <w:jc w:val="left"/>
+        <w:rPr/>
+      </w:pPr>
+      <w:r>
+        <w:rPr/>
+        <w:t xml:space="preserve">Leaderboard appears at the end. </w:t>
+      </w:r>
+    </w:p>
+    <w:p>
+      <w:pPr>
+        <w:pStyle w:val="HorizontalLine"/>
+        <w:bidi w:val="0"/>
+        <w:jc w:val="left"/>
+        <w:rPr/>
+      </w:pPr>
+      <w:r>
+        <w:rPr/>
+      </w:r>
+    </w:p>
+    <w:p>
+      <w:pPr>
+        <w:pStyle w:val="Heading2"/>
+        <w:bidi w:val="0"/>
+        <w:jc w:val="left"/>
+        <w:rPr/>
+      </w:pPr>
+      <w:r>
+        <w:rPr/>
+        <w:t>9 · Backups and sharing your work</w:t>
+      </w:r>
+    </w:p>
+    <w:p>
+      <w:pPr>
+        <w:pStyle w:val="BodyText"/>
+        <w:bidi w:val="0"/>
+        <w:jc w:val="left"/>
+        <w:rPr/>
+      </w:pPr>
+      <w:r>
+        <w:rPr>
+          <w:rStyle w:val="Strong"/>
+        </w:rPr>
+        <w:t>Your backup system is a folder of dated copies.</w:t>
+      </w:r>
+      <w:r>
+        <w:rPr/>
+        <w:t xml:space="preserve"> Before each editing session, copy the file you're about to change into </w:t>
+      </w:r>
+      <w:r>
+        <w:rPr>
+          <w:rStyle w:val="SourceText"/>
+        </w:rPr>
+        <w:t>backups/</w:t>
+      </w:r>
+      <w:r>
+        <w:rPr/>
+        <w:t xml:space="preserve"> with the date in the name. Keep them all — they're tiny. Every dated copy is a complete, working game you can go back to by simply opening it.</w:t>
+      </w:r>
+    </w:p>
+    <w:p>
+      <w:pPr>
+        <w:pStyle w:val="BodyText"/>
+        <w:bidi w:val="0"/>
+        <w:jc w:val="left"/>
+        <w:rPr/>
+      </w:pPr>
+      <w:r>
+        <w:rPr>
+          <w:rStyle w:val="Strong"/>
+        </w:rPr>
+        <w:t>Sharing an updated game = sending one file.</w:t>
+      </w:r>
+      <w:r>
+        <w:rPr/>
+        <w:t xml:space="preserve"> Because each game is fully self-contained, handing your latest version to a colleague, a presenter, or a reviewer is just sending them the </w:t>
+      </w:r>
+      <w:r>
+        <w:rPr>
+          <w:rStyle w:val="SourceText"/>
+        </w:rPr>
+        <w:t>.html</w:t>
+      </w:r>
+      <w:r>
+        <w:rPr/>
+        <w:t xml:space="preserve"> file. Nothing to install, nothing else to include. (For the Live Room at an event, also read </w:t>
+      </w:r>
+      <w:r>
+        <w:rPr>
+          <w:rStyle w:val="SourceText"/>
+        </w:rPr>
+        <w:t>live-server/README.md</w:t>
+      </w:r>
+      <w:r>
+        <w:rPr/>
+        <w:t xml:space="preserve"> — the audience's phones need a way to reach the game, which that guide explains.)</w:t>
+      </w:r>
+    </w:p>
+    <w:p>
+      <w:pPr>
+        <w:pStyle w:val="BodyText"/>
+        <w:bidi w:val="0"/>
+        <w:jc w:val="left"/>
+        <w:rPr/>
+      </w:pPr>
+      <w:r>
+        <w:rPr>
+          <w:rStyle w:val="Strong"/>
+        </w:rPr>
+        <w:t>If the game ever needs to live on a website</w:t>
+      </w:r>
+      <w:r>
+        <w:rPr/>
+        <w:t xml:space="preserve"> (so people can reach it by link rather than by file), that's a hosting request to IT — the file itself needs no changes to be hosted anywhere.</w:t>
+      </w:r>
+    </w:p>
+    <w:p>
+      <w:pPr>
+        <w:pStyle w:val="HorizontalLine"/>
+        <w:bidi w:val="0"/>
+        <w:jc w:val="left"/>
+        <w:rPr/>
+      </w:pPr>
+      <w:r>
+        <w:rPr/>
+      </w:r>
+    </w:p>
+    <w:p>
+      <w:pPr>
+        <w:pStyle w:val="Heading2"/>
+        <w:bidi w:val="0"/>
+        <w:jc w:val="left"/>
+        <w:rPr/>
+      </w:pPr>
+      <w:r>
+        <w:rPr/>
+        <w:t>10 · The rules that outrank everything (compliance)</w:t>
+      </w:r>
+    </w:p>
+    <w:p>
+      <w:pPr>
+        <w:pStyle w:val="BodyText"/>
+        <w:bidi w:val="0"/>
+        <w:jc w:val="left"/>
+        <w:rPr/>
+      </w:pPr>
+      <w:r>
+        <w:rPr/>
+        <w:t xml:space="preserve">This is a Capital Group-branded prototype with real market data and real fund performance in it. It is currently </w:t>
+      </w:r>
+      <w:r>
+        <w:rPr>
+          <w:rStyle w:val="Strong"/>
+        </w:rPr>
+        <w:t>internal / pre-approval</w:t>
+      </w:r>
+      <w:r>
+        <w:rPr/>
+        <w:t>:</w:t>
+      </w:r>
+    </w:p>
+    <w:p>
+      <w:pPr>
+        <w:pStyle w:val="BodyText"/>
+        <w:numPr>
+          <w:ilvl w:val="0"/>
+          <w:numId w:val="8"/>
+        </w:numPr>
+        <w:tabs>
+          <w:tab w:val="clear" w:pos="1134"/>
+          <w:tab w:val="left" w:pos="809" w:leader="none"/>
+        </w:tabs>
+        <w:bidi w:val="0"/>
+        <w:spacing w:before="100" w:after="0"/>
+        <w:ind w:hanging="283" w:left="809"/>
+        <w:jc w:val="left"/>
+        <w:rPr/>
+      </w:pPr>
+      <w:r>
+        <w:rPr>
+          <w:rStyle w:val="SourceText"/>
+        </w:rPr>
+        <w:t>VERIFICATION-CHECKLIST.md</w:t>
+      </w:r>
+      <w:r>
+        <w:rPr>
+          <w:rStyle w:val="Strong"/>
+        </w:rPr>
+        <w:t xml:space="preserve"> is the contract.</w:t>
+      </w:r>
+      <w:r>
+        <w:rPr/>
+        <w:t xml:space="preserve"> Nothing goes in front of a real client or external audience until the data verifications and the compliance/brand sign-offs in that file are done. If you change any number, record it there. </w:t>
+      </w:r>
+    </w:p>
+    <w:p>
+      <w:pPr>
+        <w:pStyle w:val="BodyText"/>
+        <w:numPr>
+          <w:ilvl w:val="0"/>
+          <w:numId w:val="8"/>
+        </w:numPr>
+        <w:tabs>
+          <w:tab w:val="clear" w:pos="1134"/>
+          <w:tab w:val="left" w:pos="809" w:leader="none"/>
+        </w:tabs>
+        <w:bidi w:val="0"/>
+        <w:spacing w:before="100" w:after="0"/>
+        <w:ind w:hanging="283" w:left="809"/>
+        <w:jc w:val="left"/>
+        <w:rPr/>
+      </w:pPr>
+      <w:r>
+        <w:rPr>
+          <w:rStyle w:val="Strong"/>
+        </w:rPr>
+        <w:t>Disclaimers stay.</w:t>
+      </w:r>
+      <w:r>
+        <w:rPr/>
+        <w:t xml:space="preserve"> (Rule 5 again, because it matters.) </w:t>
+      </w:r>
+    </w:p>
+    <w:p>
+      <w:pPr>
+        <w:pStyle w:val="BodyText"/>
+        <w:numPr>
+          <w:ilvl w:val="0"/>
+          <w:numId w:val="8"/>
+        </w:numPr>
+        <w:tabs>
+          <w:tab w:val="clear" w:pos="1134"/>
+          <w:tab w:val="left" w:pos="809" w:leader="none"/>
+        </w:tabs>
+        <w:bidi w:val="0"/>
+        <w:ind w:hanging="283" w:left="809"/>
+        <w:jc w:val="left"/>
+        <w:rPr/>
+      </w:pPr>
+      <w:r>
+        <w:rPr>
+          <w:rStyle w:val="Strong"/>
+        </w:rPr>
+        <w:t>The Live Room collects nothing but nicknames and votes</w:t>
+      </w:r>
+      <w:r>
+        <w:rPr/>
+        <w:t xml:space="preserve">, in throwaway rooms. Keep it that way — the moment someone suggests collecting emails through it, that's a new privacy conversation, not a Copilot prompt. </w:t>
+      </w:r>
+    </w:p>
+    <w:p>
+      <w:pPr>
+        <w:pStyle w:val="HorizontalLine"/>
+        <w:bidi w:val="0"/>
+        <w:jc w:val="left"/>
+        <w:rPr/>
+      </w:pPr>
+      <w:r>
+        <w:rPr/>
+      </w:r>
+    </w:p>
+    <w:p>
+      <w:pPr>
+        <w:pStyle w:val="Heading2"/>
+        <w:bidi w:val="0"/>
+        <w:jc w:val="left"/>
+        <w:rPr/>
+      </w:pPr>
+      <w:r>
+        <w:rPr/>
+        <w:t>11 · When something breaks and undo isn't enough</w:t>
+      </w:r>
+    </w:p>
+    <w:p>
+      <w:pPr>
+        <w:pStyle w:val="BodyText"/>
+        <w:numPr>
+          <w:ilvl w:val="0"/>
+          <w:numId w:val="9"/>
+        </w:numPr>
+        <w:tabs>
+          <w:tab w:val="clear" w:pos="1134"/>
+          <w:tab w:val="left" w:pos="809" w:leader="none"/>
+        </w:tabs>
+        <w:bidi w:val="0"/>
+        <w:spacing w:before="100" w:after="0"/>
+        <w:ind w:hanging="283" w:left="809"/>
+        <w:jc w:val="left"/>
+        <w:rPr/>
+      </w:pPr>
+      <w:r>
+        <w:rPr>
+          <w:rStyle w:val="Strong"/>
+        </w:rPr>
+        <w:t>Blank page after an edit:</w:t>
+      </w:r>
+      <w:r>
+        <w:rPr/>
+        <w:t xml:space="preserve"> almost always a broken piece of JavaScript. Press </w:t>
+      </w:r>
+      <w:r>
+        <w:rPr>
+          <w:rStyle w:val="SourceText"/>
+        </w:rPr>
+        <w:t>F12</w:t>
+      </w:r>
+      <w:r>
+        <w:rPr/>
+        <w:t xml:space="preserve"> in the browser → </w:t>
+      </w:r>
+      <w:r>
+        <w:rPr>
+          <w:rStyle w:val="Strong"/>
+        </w:rPr>
+        <w:t>Console</w:t>
+      </w:r>
+      <w:r>
+        <w:rPr/>
+        <w:t xml:space="preserve"> tab → screenshot the red error → paste it to Copilot Chat with </w:t>
+      </w:r>
+      <w:r>
+        <w:rPr>
+          <w:rStyle w:val="Emphasis"/>
+        </w:rPr>
+        <w:t>"This single-file HTML game shows a blank page, here's the console error, here's the code near it — what's the smallest fix?"</w:t>
+      </w:r>
+      <w:r>
+        <w:rPr/>
+        <w:t xml:space="preserve"> </w:t>
+      </w:r>
+    </w:p>
+    <w:p>
+      <w:pPr>
+        <w:pStyle w:val="BodyText"/>
+        <w:numPr>
+          <w:ilvl w:val="0"/>
+          <w:numId w:val="9"/>
+        </w:numPr>
+        <w:tabs>
+          <w:tab w:val="clear" w:pos="1134"/>
+          <w:tab w:val="left" w:pos="809" w:leader="none"/>
+        </w:tabs>
+        <w:bidi w:val="0"/>
+        <w:spacing w:before="100" w:after="0"/>
+        <w:ind w:hanging="283" w:left="809"/>
+        <w:jc w:val="left"/>
+        <w:rPr/>
+      </w:pPr>
+      <w:r>
+        <w:rPr>
+          <w:rStyle w:val="Strong"/>
+        </w:rPr>
+        <w:t>Chart looks wrong / numbers seem off:</w:t>
+      </w:r>
+      <w:r>
+        <w:rPr/>
+        <w:t xml:space="preserve"> re-run the Section 8 checklist, especially the all-Hold tie. If the tie fails, your change touched game math — restore your backup and re-approach with a narrower prompt. </w:t>
+      </w:r>
+    </w:p>
+    <w:p>
+      <w:pPr>
+        <w:pStyle w:val="BodyText"/>
+        <w:numPr>
+          <w:ilvl w:val="0"/>
+          <w:numId w:val="9"/>
+        </w:numPr>
+        <w:tabs>
+          <w:tab w:val="clear" w:pos="1134"/>
+          <w:tab w:val="left" w:pos="809" w:leader="none"/>
+        </w:tabs>
+        <w:bidi w:val="0"/>
+        <w:spacing w:before="100" w:after="0"/>
+        <w:ind w:hanging="283" w:left="809"/>
+        <w:jc w:val="left"/>
+        <w:rPr/>
+      </w:pPr>
+      <w:r>
+        <w:rPr>
+          <w:rStyle w:val="Strong"/>
+        </w:rPr>
+        <w:t>Live Room won't connect:</w:t>
+      </w:r>
+      <w:r>
+        <w:rPr/>
+        <w:t xml:space="preserve"> it fails loudly with an on-screen message after ~8 seconds instead of hanging. The message itself lists the likely causes (corporate network blocking, etc.). </w:t>
+      </w:r>
+      <w:r>
+        <w:rPr>
+          <w:rStyle w:val="SourceText"/>
+        </w:rPr>
+        <w:t>live-server/README.md</w:t>
+      </w:r>
+      <w:r>
+        <w:rPr/>
+        <w:t xml:space="preserve"> has the full plain-English troubleshooting list, including the phone-hotspot fallback for events. </w:t>
+      </w:r>
+    </w:p>
+    <w:p>
+      <w:pPr>
+        <w:pStyle w:val="BodyText"/>
+        <w:numPr>
+          <w:ilvl w:val="0"/>
+          <w:numId w:val="9"/>
+        </w:numPr>
+        <w:tabs>
+          <w:tab w:val="clear" w:pos="1134"/>
+          <w:tab w:val="left" w:pos="809" w:leader="none"/>
+        </w:tabs>
+        <w:bidi w:val="0"/>
+        <w:ind w:hanging="283" w:left="809"/>
+        <w:jc w:val="left"/>
+        <w:rPr/>
+      </w:pPr>
+      <w:r>
+        <w:rPr>
+          <w:rStyle w:val="Strong"/>
+        </w:rPr>
         <w:t>Totally lost:</w:t>
       </w:r>
       <w:r>
         <w:rPr/>
-        <w:t xml:space="preserve"> every version of every file ever committed is on GitHub under the repo's commit history. You can always get back to a working game. </w:t>
+        <w:t xml:space="preserve"> open today's backup copy from your </w:t>
+      </w:r>
+      <w:r>
+        <w:rPr>
+          <w:rStyle w:val="SourceText"/>
+        </w:rPr>
+        <w:t>backups</w:t>
+      </w:r>
+      <w:r>
+        <w:rPr/>
+        <w:t xml:space="preserve"> folder — it's a complete working game. Rename it back and you're exactly where you started the day. </w:t>
       </w:r>
     </w:p>
     <w:p>
@@ -4009,8 +4146,8 @@
         </w:tblCellMar>
       </w:tblPr>
       <w:tblGrid>
-        <w:gridCol w:w="1930"/>
-        <w:gridCol w:w="4478"/>
+        <w:gridCol w:w="1915"/>
+        <w:gridCol w:w="4493"/>
       </w:tblGrid>
       <w:tr>
         <w:trPr>
@@ -4018,7 +4155,7 @@
         </w:trPr>
         <w:tc>
           <w:tcPr>
-            <w:tcW w:w="1930" w:type="dxa"/>
+            <w:tcW w:w="1915" w:type="dxa"/>
             <w:tcBorders/>
             <w:vAlign w:val="center"/>
           </w:tcPr>
@@ -4026,7 +4163,7 @@
             <w:pPr>
               <w:pStyle w:val="TableHeading"/>
               <w:suppressLineNumbers/>
-              <w:shd w:fill="083469" w:val="clear"/>
+              <w:shd w:fill="008074" w:val="clear"/>
               <w:bidi w:val="0"/>
               <w:spacing w:before="100" w:after="100"/>
               <w:jc w:val="left"/>
@@ -4040,7 +4177,7 @@
         </w:tc>
         <w:tc>
           <w:tcPr>
-            <w:tcW w:w="4478" w:type="dxa"/>
+            <w:tcW w:w="4493" w:type="dxa"/>
             <w:tcBorders/>
             <w:vAlign w:val="center"/>
           </w:tcPr>
@@ -4048,7 +4185,7 @@
             <w:pPr>
               <w:pStyle w:val="TableHeading"/>
               <w:suppressLineNumbers/>
-              <w:shd w:fill="083469" w:val="clear"/>
+              <w:shd w:fill="008074" w:val="clear"/>
               <w:bidi w:val="0"/>
               <w:spacing w:before="100" w:after="100"/>
               <w:jc w:val="left"/>
@@ -4065,41 +4202,41 @@
         <w:trPr/>
         <w:tc>
           <w:tcPr>
-            <w:tcW w:w="1930" w:type="dxa"/>
-            <w:tcBorders/>
-            <w:vAlign w:val="center"/>
-          </w:tcPr>
-          <w:p>
-            <w:pPr>
-              <w:pStyle w:val="TableContents"/>
-              <w:bidi w:val="0"/>
-              <w:spacing w:before="100" w:after="100"/>
-              <w:jc w:val="left"/>
-              <w:rPr/>
-            </w:pPr>
-            <w:r>
-              <w:rPr/>
-              <w:t>Repo</w:t>
-            </w:r>
-          </w:p>
-        </w:tc>
-        <w:tc>
-          <w:tcPr>
-            <w:tcW w:w="4478" w:type="dxa"/>
-            <w:tcBorders/>
-            <w:vAlign w:val="center"/>
-          </w:tcPr>
-          <w:p>
-            <w:pPr>
-              <w:pStyle w:val="TableContents"/>
-              <w:bidi w:val="0"/>
-              <w:spacing w:before="100" w:after="100"/>
-              <w:jc w:val="left"/>
-              <w:rPr/>
-            </w:pPr>
-            <w:r>
-              <w:rPr/>
-              <w:t>The project folder as it exists on GitHub</w:t>
+            <w:tcW w:w="1915" w:type="dxa"/>
+            <w:tcBorders/>
+            <w:vAlign w:val="center"/>
+          </w:tcPr>
+          <w:p>
+            <w:pPr>
+              <w:pStyle w:val="TableContents"/>
+              <w:bidi w:val="0"/>
+              <w:spacing w:before="100" w:after="100"/>
+              <w:jc w:val="left"/>
+              <w:rPr/>
+            </w:pPr>
+            <w:r>
+              <w:rPr/>
+              <w:t>HTML / CSS / JavaScript</w:t>
+            </w:r>
+          </w:p>
+        </w:tc>
+        <w:tc>
+          <w:tcPr>
+            <w:tcW w:w="4493" w:type="dxa"/>
+            <w:tcBorders/>
+            <w:vAlign w:val="center"/>
+          </w:tcPr>
+          <w:p>
+            <w:pPr>
+              <w:pStyle w:val="TableContents"/>
+              <w:bidi w:val="0"/>
+              <w:spacing w:before="100" w:after="100"/>
+              <w:jc w:val="left"/>
+              <w:rPr/>
+            </w:pPr>
+            <w:r>
+              <w:rPr/>
+              <w:t>The words / the styling / the behavior — all inside the one file</w:t>
             </w:r>
           </w:p>
         </w:tc>
@@ -4108,61 +4245,90 @@
         <w:trPr/>
         <w:tc>
           <w:tcPr>
-            <w:tcW w:w="1930" w:type="dxa"/>
-            <w:tcBorders/>
-            <w:vAlign w:val="center"/>
-          </w:tcPr>
-          <w:p>
-            <w:pPr>
-              <w:pStyle w:val="TableContents"/>
-              <w:bidi w:val="0"/>
-              <w:spacing w:before="100" w:after="100"/>
-              <w:jc w:val="left"/>
-              <w:rPr/>
-            </w:pPr>
-            <w:r>
-              <w:rPr/>
-              <w:t>Branch</w:t>
-            </w:r>
-          </w:p>
-        </w:tc>
-        <w:tc>
-          <w:tcPr>
-            <w:tcW w:w="4478" w:type="dxa"/>
-            <w:tcBorders/>
-            <w:vAlign w:val="center"/>
-          </w:tcPr>
-          <w:p>
-            <w:pPr>
-              <w:pStyle w:val="TableContents"/>
-              <w:bidi w:val="0"/>
-              <w:spacing w:before="100" w:after="100"/>
-              <w:jc w:val="left"/>
-              <w:rPr/>
-            </w:pPr>
-            <w:r>
-              <w:rPr/>
-              <w:t>A named shelf of the files (</w:t>
+            <w:tcW w:w="1915" w:type="dxa"/>
+            <w:tcBorders/>
+            <w:vAlign w:val="center"/>
+          </w:tcPr>
+          <w:p>
+            <w:pPr>
+              <w:pStyle w:val="TableContents"/>
+              <w:bidi w:val="0"/>
+              <w:spacing w:before="100" w:after="100"/>
+              <w:jc w:val="left"/>
+              <w:rPr/>
+            </w:pPr>
+            <w:r>
+              <w:rPr/>
+              <w:t>Firebase</w:t>
+            </w:r>
+          </w:p>
+        </w:tc>
+        <w:tc>
+          <w:tcPr>
+            <w:tcW w:w="4493" w:type="dxa"/>
+            <w:tcBorders/>
+            <w:vAlign w:val="center"/>
+          </w:tcPr>
+          <w:p>
+            <w:pPr>
+              <w:pStyle w:val="TableContents"/>
+              <w:bidi w:val="0"/>
+              <w:spacing w:before="100" w:after="100"/>
+              <w:jc w:val="left"/>
+              <w:rPr/>
+            </w:pPr>
+            <w:r>
+              <w:rPr/>
+              <w:t>Google's small online service the Live Room uses to pass votes around</w:t>
+            </w:r>
+          </w:p>
+        </w:tc>
+      </w:tr>
+      <w:tr>
+        <w:trPr/>
+        <w:tc>
+          <w:tcPr>
+            <w:tcW w:w="1915" w:type="dxa"/>
+            <w:tcBorders/>
+            <w:vAlign w:val="center"/>
+          </w:tcPr>
+          <w:p>
+            <w:pPr>
+              <w:pStyle w:val="TableContents"/>
+              <w:bidi w:val="0"/>
+              <w:spacing w:before="100" w:after="100"/>
+              <w:jc w:val="left"/>
+              <w:rPr/>
+            </w:pPr>
+            <w:r>
+              <w:rPr/>
+              <w:t xml:space="preserve">Relay / </w:t>
             </w:r>
             <w:r>
               <w:rPr>
                 <w:rStyle w:val="SourceText"/>
               </w:rPr>
-              <w:t>main</w:t>
-            </w:r>
-            <w:r>
-              <w:rPr/>
-              <w:t xml:space="preserve"> = master copy, </w:t>
-            </w:r>
-            <w:r>
-              <w:rPr>
-                <w:rStyle w:val="SourceText"/>
-              </w:rPr>
-              <w:t>gh-pages</w:t>
-            </w:r>
-            <w:r>
-              <w:rPr/>
-              <w:t xml:space="preserve"> = live site)</w:t>
+              <w:t>live-server</w:t>
+            </w:r>
+          </w:p>
+        </w:tc>
+        <w:tc>
+          <w:tcPr>
+            <w:tcW w:w="4493" w:type="dxa"/>
+            <w:tcBorders/>
+            <w:vAlign w:val="center"/>
+          </w:tcPr>
+          <w:p>
+            <w:pPr>
+              <w:pStyle w:val="TableContents"/>
+              <w:bidi w:val="0"/>
+              <w:spacing w:before="100" w:after="100"/>
+              <w:jc w:val="left"/>
+              <w:rPr/>
+            </w:pPr>
+            <w:r>
+              <w:rPr/>
+              <w:t>The bundled do-it-yourself alternative to Firebase for company laptops</w:t>
             </w:r>
           </w:p>
         </w:tc>
@@ -4171,179 +4337,7 @@
         <w:trPr/>
         <w:tc>
           <w:tcPr>
-            <w:tcW w:w="1930" w:type="dxa"/>
-            <w:tcBorders/>
-            <w:vAlign w:val="center"/>
-          </w:tcPr>
-          <w:p>
-            <w:pPr>
-              <w:pStyle w:val="TableContents"/>
-              <w:bidi w:val="0"/>
-              <w:spacing w:before="100" w:after="100"/>
-              <w:jc w:val="left"/>
-              <w:rPr/>
-            </w:pPr>
-            <w:r>
-              <w:rPr/>
-              <w:t>Commit</w:t>
-            </w:r>
-          </w:p>
-        </w:tc>
-        <w:tc>
-          <w:tcPr>
-            <w:tcW w:w="4478" w:type="dxa"/>
-            <w:tcBorders/>
-            <w:vAlign w:val="center"/>
-          </w:tcPr>
-          <w:p>
-            <w:pPr>
-              <w:pStyle w:val="TableContents"/>
-              <w:bidi w:val="0"/>
-              <w:spacing w:before="100" w:after="100"/>
-              <w:jc w:val="left"/>
-              <w:rPr/>
-            </w:pPr>
-            <w:r>
-              <w:rPr/>
-              <w:t>A saved snapshot with a description — your restore points</w:t>
-            </w:r>
-          </w:p>
-        </w:tc>
-      </w:tr>
-      <w:tr>
-        <w:trPr/>
-        <w:tc>
-          <w:tcPr>
-            <w:tcW w:w="1930" w:type="dxa"/>
-            <w:tcBorders/>
-            <w:vAlign w:val="center"/>
-          </w:tcPr>
-          <w:p>
-            <w:pPr>
-              <w:pStyle w:val="TableContents"/>
-              <w:bidi w:val="0"/>
-              <w:spacing w:before="100" w:after="100"/>
-              <w:jc w:val="left"/>
-              <w:rPr/>
-            </w:pPr>
-            <w:r>
-              <w:rPr/>
-              <w:t>Push / Sync</w:t>
-            </w:r>
-          </w:p>
-        </w:tc>
-        <w:tc>
-          <w:tcPr>
-            <w:tcW w:w="4478" w:type="dxa"/>
-            <w:tcBorders/>
-            <w:vAlign w:val="center"/>
-          </w:tcPr>
-          <w:p>
-            <w:pPr>
-              <w:pStyle w:val="TableContents"/>
-              <w:bidi w:val="0"/>
-              <w:spacing w:before="100" w:after="100"/>
-              <w:jc w:val="left"/>
-              <w:rPr/>
-            </w:pPr>
-            <w:r>
-              <w:rPr/>
-              <w:t>Send your commits up to GitHub</w:t>
-            </w:r>
-          </w:p>
-        </w:tc>
-      </w:tr>
-      <w:tr>
-        <w:trPr/>
-        <w:tc>
-          <w:tcPr>
-            <w:tcW w:w="1930" w:type="dxa"/>
-            <w:tcBorders/>
-            <w:vAlign w:val="center"/>
-          </w:tcPr>
-          <w:p>
-            <w:pPr>
-              <w:pStyle w:val="TableContents"/>
-              <w:bidi w:val="0"/>
-              <w:spacing w:before="100" w:after="100"/>
-              <w:jc w:val="left"/>
-              <w:rPr/>
-            </w:pPr>
-            <w:r>
-              <w:rPr/>
-              <w:t>HTML / CSS / JavaScript</w:t>
-            </w:r>
-          </w:p>
-        </w:tc>
-        <w:tc>
-          <w:tcPr>
-            <w:tcW w:w="4478" w:type="dxa"/>
-            <w:tcBorders/>
-            <w:vAlign w:val="center"/>
-          </w:tcPr>
-          <w:p>
-            <w:pPr>
-              <w:pStyle w:val="TableContents"/>
-              <w:bidi w:val="0"/>
-              <w:spacing w:before="100" w:after="100"/>
-              <w:jc w:val="left"/>
-              <w:rPr/>
-            </w:pPr>
-            <w:r>
-              <w:rPr/>
-              <w:t>The words / the styling / the behavior — all inside the one file</w:t>
-            </w:r>
-          </w:p>
-        </w:tc>
-      </w:tr>
-      <w:tr>
-        <w:trPr/>
-        <w:tc>
-          <w:tcPr>
-            <w:tcW w:w="1930" w:type="dxa"/>
-            <w:tcBorders/>
-            <w:vAlign w:val="center"/>
-          </w:tcPr>
-          <w:p>
-            <w:pPr>
-              <w:pStyle w:val="TableContents"/>
-              <w:bidi w:val="0"/>
-              <w:spacing w:before="100" w:after="100"/>
-              <w:jc w:val="left"/>
-              <w:rPr/>
-            </w:pPr>
-            <w:r>
-              <w:rPr/>
-              <w:t>Firebase</w:t>
-            </w:r>
-          </w:p>
-        </w:tc>
-        <w:tc>
-          <w:tcPr>
-            <w:tcW w:w="4478" w:type="dxa"/>
-            <w:tcBorders/>
-            <w:vAlign w:val="center"/>
-          </w:tcPr>
-          <w:p>
-            <w:pPr>
-              <w:pStyle w:val="TableContents"/>
-              <w:bidi w:val="0"/>
-              <w:spacing w:before="100" w:after="100"/>
-              <w:jc w:val="left"/>
-              <w:rPr/>
-            </w:pPr>
-            <w:r>
-              <w:rPr/>
-              <w:t>Google's small online service the Live Room uses to pass votes around</w:t>
-            </w:r>
-          </w:p>
-        </w:tc>
-      </w:tr>
-      <w:tr>
-        <w:trPr/>
-        <w:tc>
-          <w:tcPr>
-            <w:tcW w:w="1930" w:type="dxa"/>
+            <w:tcW w:w="1915" w:type="dxa"/>
             <w:tcBorders/>
             <w:vAlign w:val="center"/>
           </w:tcPr>
@@ -4365,7 +4359,7 @@
         </w:tc>
         <w:tc>
           <w:tcPr>
-            <w:tcW w:w="4478" w:type="dxa"/>
+            <w:tcW w:w="4493" w:type="dxa"/>
             <w:tcBorders/>
             <w:vAlign w:val="center"/>
           </w:tcPr>
@@ -4380,6 +4374,49 @@
             <w:r>
               <w:rPr/>
               <w:t>"Here is a named value the game uses" — the settings knobs live in lines like this</w:t>
+            </w:r>
+          </w:p>
+        </w:tc>
+      </w:tr>
+      <w:tr>
+        <w:trPr/>
+        <w:tc>
+          <w:tcPr>
+            <w:tcW w:w="1915" w:type="dxa"/>
+            <w:tcBorders/>
+            <w:vAlign w:val="center"/>
+          </w:tcPr>
+          <w:p>
+            <w:pPr>
+              <w:pStyle w:val="TableContents"/>
+              <w:bidi w:val="0"/>
+              <w:spacing w:before="100" w:after="100"/>
+              <w:jc w:val="left"/>
+              <w:rPr/>
+            </w:pPr>
+            <w:r>
+              <w:rPr/>
+              <w:t>Vendored library</w:t>
+            </w:r>
+          </w:p>
+        </w:tc>
+        <w:tc>
+          <w:tcPr>
+            <w:tcW w:w="4493" w:type="dxa"/>
+            <w:tcBorders/>
+            <w:vAlign w:val="center"/>
+          </w:tcPr>
+          <w:p>
+            <w:pPr>
+              <w:pStyle w:val="TableContents"/>
+              <w:bidi w:val="0"/>
+              <w:spacing w:before="100" w:after="100"/>
+              <w:jc w:val="left"/>
+              <w:rPr/>
+            </w:pPr>
+            <w:r>
+              <w:rPr/>
+              <w:t>Someone else's finished code pasted into the file so the game works offline — never edit it</w:t>
             </w:r>
           </w:p>
         </w:tc>
@@ -4389,29 +4426,44 @@
       <w:pPr>
         <w:pStyle w:val="BodyText"/>
         <w:pBdr>
-          <w:top w:val="single" w:sz="6" w:space="5" w:color="C9D6DD"/>
+          <w:top w:val="single" w:sz="6" w:space="6" w:color="CFDCE2"/>
         </w:pBdr>
         <w:bidi w:val="0"/>
-        <w:spacing w:before="440" w:after="100"/>
+        <w:spacing w:before="480" w:after="100"/>
         <w:ind w:hanging="0" w:left="0" w:right="0"/>
         <w:jc w:val="left"/>
         <w:rPr>
-          <w:color w:val="5F7081"/>
+          <w:color w:val="6B7F8E"/>
           <w:sz w:val="17"/>
         </w:rPr>
       </w:pPr>
       <w:r>
         <w:rPr>
-          <w:color w:val="5F7081"/>
+          <w:color w:val="6B7F8E"/>
           <w:sz w:val="17"/>
         </w:rPr>
-        <w:t>The Long Game · Handover Guide · generated from HANDOVER.md (July 2026). The Markdown file in the repository is the master copy — regenerate this document after editing it.</w:t>
+        <w:t xml:space="preserve">The Long Game · Handover Guide · July 2026 · The file </w:t>
+      </w:r>
+      <w:r>
+        <w:rPr>
+          <w:rFonts w:ascii="Consolas;monospace" w:hAnsi="Consolas;monospace"/>
+          <w:color w:val="6B7F8E"/>
+          <w:sz w:val="17"/>
+        </w:rPr>
+        <w:t>HANDOVER.md</w:t>
+      </w:r>
+      <w:r>
+        <w:rPr>
+          <w:color w:val="6B7F8E"/>
+          <w:sz w:val="17"/>
+        </w:rPr>
+        <w:t xml:space="preserve"> in the project folder is the master copy of this document.</w:t>
       </w:r>
     </w:p>
     <w:sectPr>
       <w:type w:val="nextPage"/>
       <w:pgSz w:w="11906" w:h="16838"/>
-      <w:pgMar w:left="1247" w:right="1247" w:gutter="0" w:header="0" w:top="1134" w:footer="0" w:bottom="1134"/>
+      <w:pgMar w:left="1134" w:right="1134" w:gutter="0" w:header="0" w:top="1020" w:footer="0" w:bottom="1134"/>
       <w:pgNumType w:fmt="decimal"/>
       <w:formProt w:val="false"/>
       <w:textDirection w:val="lrTb"/>
@@ -4938,8 +4990,8 @@
   <w:abstractNum w:abstractNumId="5">
     <w:lvl w:ilvl="0">
       <w:start w:val="1"/>
-      <w:numFmt w:val="decimal"/>
-      <w:lvlText w:val="%1."/>
+      <w:numFmt w:val="bullet"/>
+      <w:lvlText w:val=""/>
       <w:lvlJc w:val="left"/>
       <w:pPr>
         <w:tabs>
@@ -4947,12 +4999,14 @@
         </w:tabs>
         <w:ind w:left="709" w:hanging="283"/>
       </w:pPr>
-      <w:rPr/>
+      <w:rPr>
+        <w:rFonts w:ascii="Symbol" w:hAnsi="Symbol" w:cs="Symbol" w:hint="default"/>
+      </w:rPr>
     </w:lvl>
     <w:lvl w:ilvl="1">
       <w:start w:val="1"/>
-      <w:numFmt w:val="decimal"/>
-      <w:lvlText w:val="%2."/>
+      <w:numFmt w:val="bullet"/>
+      <w:lvlText w:val=""/>
       <w:lvlJc w:val="left"/>
       <w:pPr>
         <w:tabs>
@@ -4960,12 +5014,14 @@
         </w:tabs>
         <w:ind w:left="1418" w:hanging="283"/>
       </w:pPr>
-      <w:rPr/>
+      <w:rPr>
+        <w:rFonts w:ascii="Symbol" w:hAnsi="Symbol" w:cs="Symbol" w:hint="default"/>
+      </w:rPr>
     </w:lvl>
     <w:lvl w:ilvl="2">
       <w:start w:val="1"/>
-      <w:numFmt w:val="decimal"/>
-      <w:lvlText w:val="%3."/>
+      <w:numFmt w:val="bullet"/>
+      <w:lvlText w:val=""/>
       <w:lvlJc w:val="left"/>
       <w:pPr>
         <w:tabs>
@@ -4973,12 +5029,14 @@
         </w:tabs>
         <w:ind w:left="2127" w:hanging="283"/>
       </w:pPr>
-      <w:rPr/>
+      <w:rPr>
+        <w:rFonts w:ascii="Symbol" w:hAnsi="Symbol" w:cs="Symbol" w:hint="default"/>
+      </w:rPr>
     </w:lvl>
     <w:lvl w:ilvl="3">
       <w:start w:val="1"/>
-      <w:numFmt w:val="decimal"/>
-      <w:lvlText w:val="%4."/>
+      <w:numFmt w:val="bullet"/>
+      <w:lvlText w:val=""/>
       <w:lvlJc w:val="left"/>
       <w:pPr>
         <w:tabs>
@@ -4986,12 +5044,14 @@
         </w:tabs>
         <w:ind w:left="2836" w:hanging="283"/>
       </w:pPr>
-      <w:rPr/>
+      <w:rPr>
+        <w:rFonts w:ascii="Symbol" w:hAnsi="Symbol" w:cs="Symbol" w:hint="default"/>
+      </w:rPr>
     </w:lvl>
     <w:lvl w:ilvl="4">
       <w:start w:val="1"/>
-      <w:numFmt w:val="decimal"/>
-      <w:lvlText w:val="%5."/>
+      <w:numFmt w:val="bullet"/>
+      <w:lvlText w:val=""/>
       <w:lvlJc w:val="left"/>
       <w:pPr>
         <w:tabs>
@@ -4999,12 +5059,14 @@
         </w:tabs>
         <w:ind w:left="3545" w:hanging="283"/>
       </w:pPr>
-      <w:rPr/>
+      <w:rPr>
+        <w:rFonts w:ascii="Symbol" w:hAnsi="Symbol" w:cs="Symbol" w:hint="default"/>
+      </w:rPr>
     </w:lvl>
     <w:lvl w:ilvl="5">
       <w:start w:val="1"/>
-      <w:numFmt w:val="decimal"/>
-      <w:lvlText w:val="%6."/>
+      <w:numFmt w:val="bullet"/>
+      <w:lvlText w:val=""/>
       <w:lvlJc w:val="left"/>
       <w:pPr>
         <w:tabs>
@@ -5012,12 +5074,14 @@
         </w:tabs>
         <w:ind w:left="4254" w:hanging="283"/>
       </w:pPr>
-      <w:rPr/>
+      <w:rPr>
+        <w:rFonts w:ascii="Symbol" w:hAnsi="Symbol" w:cs="Symbol" w:hint="default"/>
+      </w:rPr>
     </w:lvl>
     <w:lvl w:ilvl="6">
       <w:start w:val="1"/>
-      <w:numFmt w:val="decimal"/>
-      <w:lvlText w:val="%7."/>
+      <w:numFmt w:val="bullet"/>
+      <w:lvlText w:val=""/>
       <w:lvlJc w:val="left"/>
       <w:pPr>
         <w:tabs>
@@ -5025,12 +5089,14 @@
         </w:tabs>
         <w:ind w:left="4963" w:hanging="283"/>
       </w:pPr>
-      <w:rPr/>
+      <w:rPr>
+        <w:rFonts w:ascii="Symbol" w:hAnsi="Symbol" w:cs="Symbol" w:hint="default"/>
+      </w:rPr>
     </w:lvl>
     <w:lvl w:ilvl="7">
       <w:start w:val="1"/>
-      <w:numFmt w:val="decimal"/>
-      <w:lvlText w:val="%8."/>
+      <w:numFmt w:val="bullet"/>
+      <w:lvlText w:val=""/>
       <w:lvlJc w:val="left"/>
       <w:pPr>
         <w:tabs>
@@ -5038,12 +5104,14 @@
         </w:tabs>
         <w:ind w:left="5672" w:hanging="283"/>
       </w:pPr>
-      <w:rPr/>
+      <w:rPr>
+        <w:rFonts w:ascii="Symbol" w:hAnsi="Symbol" w:cs="Symbol" w:hint="default"/>
+      </w:rPr>
     </w:lvl>
     <w:lvl w:ilvl="8">
       <w:start w:val="1"/>
-      <w:numFmt w:val="decimal"/>
-      <w:lvlText w:val="%9."/>
+      <w:numFmt w:val="bullet"/>
+      <w:lvlText w:val=""/>
       <w:lvlJc w:val="left"/>
       <w:pPr>
         <w:tabs>
@@ -5051,7 +5119,9 @@
         </w:tabs>
         <w:ind w:left="6381" w:hanging="283"/>
       </w:pPr>
-      <w:rPr/>
+      <w:rPr>
+        <w:rFonts w:ascii="Symbol" w:hAnsi="Symbol" w:cs="Symbol" w:hint="default"/>
+      </w:rPr>
     </w:lvl>
   </w:abstractNum>
   <w:abstractNum w:abstractNumId="6">
@@ -5192,6 +5262,399 @@
     </w:lvl>
   </w:abstractNum>
   <w:abstractNum w:abstractNumId="7">
+    <w:lvl w:ilvl="0">
+      <w:start w:val="1"/>
+      <w:numFmt w:val="bullet"/>
+      <w:lvlText w:val=""/>
+      <w:lvlJc w:val="left"/>
+      <w:pPr>
+        <w:tabs>
+          <w:tab w:val="num" w:pos="709"/>
+        </w:tabs>
+        <w:ind w:left="709" w:hanging="283"/>
+      </w:pPr>
+      <w:rPr>
+        <w:rFonts w:ascii="Symbol" w:hAnsi="Symbol" w:cs="Symbol" w:hint="default"/>
+      </w:rPr>
+    </w:lvl>
+    <w:lvl w:ilvl="1">
+      <w:start w:val="1"/>
+      <w:numFmt w:val="bullet"/>
+      <w:lvlText w:val=""/>
+      <w:lvlJc w:val="left"/>
+      <w:pPr>
+        <w:tabs>
+          <w:tab w:val="num" w:pos="1418"/>
+        </w:tabs>
+        <w:ind w:left="1418" w:hanging="283"/>
+      </w:pPr>
+      <w:rPr>
+        <w:rFonts w:ascii="Symbol" w:hAnsi="Symbol" w:cs="Symbol" w:hint="default"/>
+      </w:rPr>
+    </w:lvl>
+    <w:lvl w:ilvl="2">
+      <w:start w:val="1"/>
+      <w:numFmt w:val="bullet"/>
+      <w:lvlText w:val=""/>
+      <w:lvlJc w:val="left"/>
+      <w:pPr>
+        <w:tabs>
+          <w:tab w:val="num" w:pos="2127"/>
+        </w:tabs>
+        <w:ind w:left="2127" w:hanging="283"/>
+      </w:pPr>
+      <w:rPr>
+        <w:rFonts w:ascii="Symbol" w:hAnsi="Symbol" w:cs="Symbol" w:hint="default"/>
+      </w:rPr>
+    </w:lvl>
+    <w:lvl w:ilvl="3">
+      <w:start w:val="1"/>
+      <w:numFmt w:val="bullet"/>
+      <w:lvlText w:val=""/>
+      <w:lvlJc w:val="left"/>
+      <w:pPr>
+        <w:tabs>
+          <w:tab w:val="num" w:pos="2836"/>
+        </w:tabs>
+        <w:ind w:left="2836" w:hanging="283"/>
+      </w:pPr>
+      <w:rPr>
+        <w:rFonts w:ascii="Symbol" w:hAnsi="Symbol" w:cs="Symbol" w:hint="default"/>
+      </w:rPr>
+    </w:lvl>
+    <w:lvl w:ilvl="4">
+      <w:start w:val="1"/>
+      <w:numFmt w:val="bullet"/>
+      <w:lvlText w:val=""/>
+      <w:lvlJc w:val="left"/>
+      <w:pPr>
+        <w:tabs>
+          <w:tab w:val="num" w:pos="3545"/>
+        </w:tabs>
+        <w:ind w:left="3545" w:hanging="283"/>
+      </w:pPr>
+      <w:rPr>
+        <w:rFonts w:ascii="Symbol" w:hAnsi="Symbol" w:cs="Symbol" w:hint="default"/>
+      </w:rPr>
+    </w:lvl>
+    <w:lvl w:ilvl="5">
+      <w:start w:val="1"/>
+      <w:numFmt w:val="bullet"/>
+      <w:lvlText w:val=""/>
+      <w:lvlJc w:val="left"/>
+      <w:pPr>
+        <w:tabs>
+          <w:tab w:val="num" w:pos="4254"/>
+        </w:tabs>
+        <w:ind w:left="4254" w:hanging="283"/>
+      </w:pPr>
+      <w:rPr>
+        <w:rFonts w:ascii="Symbol" w:hAnsi="Symbol" w:cs="Symbol" w:hint="default"/>
+      </w:rPr>
+    </w:lvl>
+    <w:lvl w:ilvl="6">
+      <w:start w:val="1"/>
+      <w:numFmt w:val="bullet"/>
+      <w:lvlText w:val=""/>
+      <w:lvlJc w:val="left"/>
+      <w:pPr>
+        <w:tabs>
+          <w:tab w:val="num" w:pos="4963"/>
+        </w:tabs>
+        <w:ind w:left="4963" w:hanging="283"/>
+      </w:pPr>
+      <w:rPr>
+        <w:rFonts w:ascii="Symbol" w:hAnsi="Symbol" w:cs="Symbol" w:hint="default"/>
+      </w:rPr>
+    </w:lvl>
+    <w:lvl w:ilvl="7">
+      <w:start w:val="1"/>
+      <w:numFmt w:val="bullet"/>
+      <w:lvlText w:val=""/>
+      <w:lvlJc w:val="left"/>
+      <w:pPr>
+        <w:tabs>
+          <w:tab w:val="num" w:pos="5672"/>
+        </w:tabs>
+        <w:ind w:left="5672" w:hanging="283"/>
+      </w:pPr>
+      <w:rPr>
+        <w:rFonts w:ascii="Symbol" w:hAnsi="Symbol" w:cs="Symbol" w:hint="default"/>
+      </w:rPr>
+    </w:lvl>
+    <w:lvl w:ilvl="8">
+      <w:start w:val="1"/>
+      <w:numFmt w:val="bullet"/>
+      <w:lvlText w:val=""/>
+      <w:lvlJc w:val="left"/>
+      <w:pPr>
+        <w:tabs>
+          <w:tab w:val="num" w:pos="6381"/>
+        </w:tabs>
+        <w:ind w:left="6381" w:hanging="283"/>
+      </w:pPr>
+      <w:rPr>
+        <w:rFonts w:ascii="Symbol" w:hAnsi="Symbol" w:cs="Symbol" w:hint="default"/>
+      </w:rPr>
+    </w:lvl>
+  </w:abstractNum>
+  <w:abstractNum w:abstractNumId="8">
+    <w:lvl w:ilvl="0">
+      <w:start w:val="1"/>
+      <w:numFmt w:val="decimal"/>
+      <w:lvlText w:val="%1."/>
+      <w:lvlJc w:val="left"/>
+      <w:pPr>
+        <w:tabs>
+          <w:tab w:val="num" w:pos="709"/>
+        </w:tabs>
+        <w:ind w:left="709" w:hanging="283"/>
+      </w:pPr>
+      <w:rPr/>
+    </w:lvl>
+    <w:lvl w:ilvl="1">
+      <w:start w:val="1"/>
+      <w:numFmt w:val="decimal"/>
+      <w:lvlText w:val="%2."/>
+      <w:lvlJc w:val="left"/>
+      <w:pPr>
+        <w:tabs>
+          <w:tab w:val="num" w:pos="1418"/>
+        </w:tabs>
+        <w:ind w:left="1418" w:hanging="283"/>
+      </w:pPr>
+      <w:rPr/>
+    </w:lvl>
+    <w:lvl w:ilvl="2">
+      <w:start w:val="1"/>
+      <w:numFmt w:val="decimal"/>
+      <w:lvlText w:val="%3."/>
+      <w:lvlJc w:val="left"/>
+      <w:pPr>
+        <w:tabs>
+          <w:tab w:val="num" w:pos="2127"/>
+        </w:tabs>
+        <w:ind w:left="2127" w:hanging="283"/>
+      </w:pPr>
+      <w:rPr/>
+    </w:lvl>
+    <w:lvl w:ilvl="3">
+      <w:start w:val="1"/>
+      <w:numFmt w:val="decimal"/>
+      <w:lvlText w:val="%4."/>
+      <w:lvlJc w:val="left"/>
+      <w:pPr>
+        <w:tabs>
+          <w:tab w:val="num" w:pos="2836"/>
+        </w:tabs>
+        <w:ind w:left="2836" w:hanging="283"/>
+      </w:pPr>
+      <w:rPr/>
+    </w:lvl>
+    <w:lvl w:ilvl="4">
+      <w:start w:val="1"/>
+      <w:numFmt w:val="decimal"/>
+      <w:lvlText w:val="%5."/>
+      <w:lvlJc w:val="left"/>
+      <w:pPr>
+        <w:tabs>
+          <w:tab w:val="num" w:pos="3545"/>
+        </w:tabs>
+        <w:ind w:left="3545" w:hanging="283"/>
+      </w:pPr>
+      <w:rPr/>
+    </w:lvl>
+    <w:lvl w:ilvl="5">
+      <w:start w:val="1"/>
+      <w:numFmt w:val="decimal"/>
+      <w:lvlText w:val="%6."/>
+      <w:lvlJc w:val="left"/>
+      <w:pPr>
+        <w:tabs>
+          <w:tab w:val="num" w:pos="4254"/>
+        </w:tabs>
+        <w:ind w:left="4254" w:hanging="283"/>
+      </w:pPr>
+      <w:rPr/>
+    </w:lvl>
+    <w:lvl w:ilvl="6">
+      <w:start w:val="1"/>
+      <w:numFmt w:val="decimal"/>
+      <w:lvlText w:val="%7."/>
+      <w:lvlJc w:val="left"/>
+      <w:pPr>
+        <w:tabs>
+          <w:tab w:val="num" w:pos="4963"/>
+        </w:tabs>
+        <w:ind w:left="4963" w:hanging="283"/>
+      </w:pPr>
+      <w:rPr/>
+    </w:lvl>
+    <w:lvl w:ilvl="7">
+      <w:start w:val="1"/>
+      <w:numFmt w:val="decimal"/>
+      <w:lvlText w:val="%8."/>
+      <w:lvlJc w:val="left"/>
+      <w:pPr>
+        <w:tabs>
+          <w:tab w:val="num" w:pos="5672"/>
+        </w:tabs>
+        <w:ind w:left="5672" w:hanging="283"/>
+      </w:pPr>
+      <w:rPr/>
+    </w:lvl>
+    <w:lvl w:ilvl="8">
+      <w:start w:val="1"/>
+      <w:numFmt w:val="decimal"/>
+      <w:lvlText w:val="%9."/>
+      <w:lvlJc w:val="left"/>
+      <w:pPr>
+        <w:tabs>
+          <w:tab w:val="num" w:pos="6381"/>
+        </w:tabs>
+        <w:ind w:left="6381" w:hanging="283"/>
+      </w:pPr>
+      <w:rPr/>
+    </w:lvl>
+  </w:abstractNum>
+  <w:abstractNum w:abstractNumId="9">
+    <w:lvl w:ilvl="0">
+      <w:start w:val="1"/>
+      <w:numFmt w:val="bullet"/>
+      <w:lvlText w:val=""/>
+      <w:lvlJc w:val="left"/>
+      <w:pPr>
+        <w:tabs>
+          <w:tab w:val="num" w:pos="709"/>
+        </w:tabs>
+        <w:ind w:left="709" w:hanging="283"/>
+      </w:pPr>
+      <w:rPr>
+        <w:rFonts w:ascii="Symbol" w:hAnsi="Symbol" w:cs="Symbol" w:hint="default"/>
+      </w:rPr>
+    </w:lvl>
+    <w:lvl w:ilvl="1">
+      <w:start w:val="1"/>
+      <w:numFmt w:val="bullet"/>
+      <w:lvlText w:val=""/>
+      <w:lvlJc w:val="left"/>
+      <w:pPr>
+        <w:tabs>
+          <w:tab w:val="num" w:pos="1418"/>
+        </w:tabs>
+        <w:ind w:left="1418" w:hanging="283"/>
+      </w:pPr>
+      <w:rPr>
+        <w:rFonts w:ascii="Symbol" w:hAnsi="Symbol" w:cs="Symbol" w:hint="default"/>
+      </w:rPr>
+    </w:lvl>
+    <w:lvl w:ilvl="2">
+      <w:start w:val="1"/>
+      <w:numFmt w:val="bullet"/>
+      <w:lvlText w:val=""/>
+      <w:lvlJc w:val="left"/>
+      <w:pPr>
+        <w:tabs>
+          <w:tab w:val="num" w:pos="2127"/>
+        </w:tabs>
+        <w:ind w:left="2127" w:hanging="283"/>
+      </w:pPr>
+      <w:rPr>
+        <w:rFonts w:ascii="Symbol" w:hAnsi="Symbol" w:cs="Symbol" w:hint="default"/>
+      </w:rPr>
+    </w:lvl>
+    <w:lvl w:ilvl="3">
+      <w:start w:val="1"/>
+      <w:numFmt w:val="bullet"/>
+      <w:lvlText w:val=""/>
+      <w:lvlJc w:val="left"/>
+      <w:pPr>
+        <w:tabs>
+          <w:tab w:val="num" w:pos="2836"/>
+        </w:tabs>
+        <w:ind w:left="2836" w:hanging="283"/>
+      </w:pPr>
+      <w:rPr>
+        <w:rFonts w:ascii="Symbol" w:hAnsi="Symbol" w:cs="Symbol" w:hint="default"/>
+      </w:rPr>
+    </w:lvl>
+    <w:lvl w:ilvl="4">
+      <w:start w:val="1"/>
+      <w:numFmt w:val="bullet"/>
+      <w:lvlText w:val=""/>
+      <w:lvlJc w:val="left"/>
+      <w:pPr>
+        <w:tabs>
+          <w:tab w:val="num" w:pos="3545"/>
+        </w:tabs>
+        <w:ind w:left="3545" w:hanging="283"/>
+      </w:pPr>
+      <w:rPr>
+        <w:rFonts w:ascii="Symbol" w:hAnsi="Symbol" w:cs="Symbol" w:hint="default"/>
+      </w:rPr>
+    </w:lvl>
+    <w:lvl w:ilvl="5">
+      <w:start w:val="1"/>
+      <w:numFmt w:val="bullet"/>
+      <w:lvlText w:val=""/>
+      <w:lvlJc w:val="left"/>
+      <w:pPr>
+        <w:tabs>
+          <w:tab w:val="num" w:pos="4254"/>
+        </w:tabs>
+        <w:ind w:left="4254" w:hanging="283"/>
+      </w:pPr>
+      <w:rPr>
+        <w:rFonts w:ascii="Symbol" w:hAnsi="Symbol" w:cs="Symbol" w:hint="default"/>
+      </w:rPr>
+    </w:lvl>
+    <w:lvl w:ilvl="6">
+      <w:start w:val="1"/>
+      <w:numFmt w:val="bullet"/>
+      <w:lvlText w:val=""/>
+      <w:lvlJc w:val="left"/>
+      <w:pPr>
+        <w:tabs>
+          <w:tab w:val="num" w:pos="4963"/>
+        </w:tabs>
+        <w:ind w:left="4963" w:hanging="283"/>
+      </w:pPr>
+      <w:rPr>
+        <w:rFonts w:ascii="Symbol" w:hAnsi="Symbol" w:cs="Symbol" w:hint="default"/>
+      </w:rPr>
+    </w:lvl>
+    <w:lvl w:ilvl="7">
+      <w:start w:val="1"/>
+      <w:numFmt w:val="bullet"/>
+      <w:lvlText w:val=""/>
+      <w:lvlJc w:val="left"/>
+      <w:pPr>
+        <w:tabs>
+          <w:tab w:val="num" w:pos="5672"/>
+        </w:tabs>
+        <w:ind w:left="5672" w:hanging="283"/>
+      </w:pPr>
+      <w:rPr>
+        <w:rFonts w:ascii="Symbol" w:hAnsi="Symbol" w:cs="Symbol" w:hint="default"/>
+      </w:rPr>
+    </w:lvl>
+    <w:lvl w:ilvl="8">
+      <w:start w:val="1"/>
+      <w:numFmt w:val="bullet"/>
+      <w:lvlText w:val=""/>
+      <w:lvlJc w:val="left"/>
+      <w:pPr>
+        <w:tabs>
+          <w:tab w:val="num" w:pos="6381"/>
+        </w:tabs>
+        <w:ind w:left="6381" w:hanging="283"/>
+      </w:pPr>
+      <w:rPr>
+        <w:rFonts w:ascii="Symbol" w:hAnsi="Symbol" w:cs="Symbol" w:hint="default"/>
+      </w:rPr>
+    </w:lvl>
+  </w:abstractNum>
+  <w:abstractNum w:abstractNumId="10">
     <w:lvl w:ilvl="0">
       <w:start w:val="1"/>
       <w:numFmt w:val="none"/>
@@ -5333,6 +5796,15 @@
   <w:num w:numId="7">
     <w:abstractNumId w:val="7"/>
   </w:num>
+  <w:num w:numId="8">
+    <w:abstractNumId w:val="8"/>
+  </w:num>
+  <w:num w:numId="9">
+    <w:abstractNumId w:val="9"/>
+  </w:num>
+  <w:num w:numId="10">
+    <w:abstractNumId w:val="10"/>
+  </w:num>
 </w:numbering>
 </file>
 
@@ -5359,11 +5831,11 @@
     <w:pPr>
       <w:widowControl w:val="false"/>
       <w:bidi w:val="0"/>
-      <w:spacing w:lineRule="auto" w:line="348"/>
+      <w:spacing w:lineRule="auto" w:line="360"/>
     </w:pPr>
     <w:rPr>
       <w:rFonts w:ascii="Calibri;Carlito;sans-serif" w:hAnsi="Calibri;Carlito;sans-serif" w:eastAsia="Calibri;Carlito;sans-serif" w:cs="Calibri;Carlito;sans-serif"/>
-      <w:color w:val="1C2B39"/>
+      <w:color w:val="22313F"/>
       <w:sz w:val="21"/>
       <w:szCs w:val="21"/>
       <w:lang w:val="en-US" w:eastAsia="zh-CN" w:bidi="hi-IN"/>
@@ -5374,19 +5846,13 @@
     <w:basedOn w:val="Heading"/>
     <w:next w:val="BodyText"/>
     <w:qFormat/>
-    <w:pPr>
-      <w:pBdr>
-        <w:bottom w:val="single" w:sz="20" w:space="6" w:color="008074"/>
-      </w:pBdr>
-      <w:spacing w:before="240" w:after="200"/>
-    </w:pPr>
+    <w:pPr/>
     <w:rPr>
-      <w:rFonts w:ascii="Calibri;Carlito;sans-serif" w:hAnsi="Calibri;Carlito;sans-serif" w:eastAsia="Calibri;Carlito;sans-serif" w:cs="Calibri;Carlito;sans-serif"/>
+      <w:rFonts w:ascii="Noto Sans" w:hAnsi="Noto Sans"/>
       <w:b/>
       <w:bCs/>
-      <w:color w:val="083469"/>
-      <w:sz w:val="40"/>
-      <w:szCs w:val="40"/>
+      <w:sz w:val="48"/>
+      <w:szCs w:val="44"/>
     </w:rPr>
   </w:style>
   <w:style w:type="paragraph" w:styleId="Heading2">
@@ -5395,20 +5861,19 @@
     <w:next w:val="BodyText"/>
     <w:qFormat/>
     <w:pPr>
-      <w:pBdr>
-        <w:bottom w:val="single" w:sz="6" w:space="3" w:color="C9D6DD"/>
-      </w:pBdr>
-      <w:spacing w:before="360" w:after="120"/>
-      <w:ind w:left="360" w:right="360"/>
+      <w:pBdr/>
+      <w:shd w:fill="083469" w:val="clear"/>
+      <w:spacing w:before="400" w:after="160"/>
+      <w:ind w:left="400" w:right="400"/>
       <w:outlineLvl w:val="1"/>
     </w:pPr>
     <w:rPr>
       <w:rFonts w:ascii="Calibri;Carlito;sans-serif" w:hAnsi="Calibri;Carlito;sans-serif" w:eastAsia="Calibri;Carlito;sans-serif" w:cs="Calibri;Carlito;sans-serif"/>
       <w:b/>
       <w:bCs/>
-      <w:color w:val="083469"/>
-      <w:sz w:val="28"/>
-      <w:szCs w:val="28"/>
+      <w:color w:val="FFFFFF"/>
+      <w:sz w:val="27"/>
+      <w:szCs w:val="27"/>
     </w:rPr>
   </w:style>
   <w:style w:type="paragraph" w:styleId="Heading3">
@@ -5417,15 +5882,18 @@
     <w:next w:val="BodyText"/>
     <w:qFormat/>
     <w:pPr>
-      <w:spacing w:before="240" w:after="80"/>
-      <w:ind w:left="240" w:right="240"/>
+      <w:pBdr>
+        <w:bottom w:val="single" w:sz="8" w:space="2" w:color="00D190"/>
+      </w:pBdr>
+      <w:spacing w:before="280" w:after="100"/>
+      <w:ind w:left="280" w:right="280"/>
       <w:outlineLvl w:val="2"/>
     </w:pPr>
     <w:rPr>
       <w:rFonts w:ascii="Calibri;Carlito;sans-serif" w:hAnsi="Calibri;Carlito;sans-serif" w:eastAsia="Calibri;Carlito;sans-serif" w:cs="Calibri;Carlito;sans-serif"/>
       <w:b/>
       <w:bCs/>
-      <w:color w:val="008074"/>
+      <w:color w:val="083469"/>
       <w:sz w:val="23"/>
       <w:szCs w:val="23"/>
     </w:rPr>
@@ -5452,10 +5920,10 @@
     <w:qFormat/>
     <w:rPr>
       <w:rFonts w:ascii="Consolas;Courier New;monospace" w:hAnsi="Consolas;Courier New;monospace" w:eastAsia="Consolas;Courier New;monospace" w:cs="Consolas;Courier New;monospace"/>
-      <w:color w:val="83224F"/>
+      <w:color w:val="831574"/>
       <w:sz w:val="19"/>
       <w:szCs w:val="19"/>
-      <w:shd w:fill="EEF3F5" w:val="clear"/>
+      <w:shd w:fill="EDF3F2" w:val="clear"/>
     </w:rPr>
   </w:style>
   <w:style w:type="character" w:styleId="Strong">
@@ -5622,14 +6090,11 @@
     <w:qFormat/>
     <w:pPr>
       <w:pBdr>
-        <w:top w:val="single" w:sz="4" w:space="7" w:color="C9D6DD"/>
-        <w:left w:val="single" w:sz="4" w:space="9" w:color="C9D6DD"/>
-        <w:bottom w:val="single" w:sz="4" w:space="7" w:color="C9D6DD"/>
-        <w:right w:val="single" w:sz="4" w:space="9" w:color="C9D6DD"/>
+        <w:left w:val="single" w:sz="24" w:space="10" w:color="008074"/>
       </w:pBdr>
-      <w:shd w:fill="EEF3F5" w:val="clear"/>
-      <w:spacing w:before="140" w:after="140"/>
-      <w:ind w:left="140" w:right="140"/>
+      <w:shd w:fill="F0F6F5" w:val="clear"/>
+      <w:spacing w:before="160" w:after="160"/>
+      <w:ind w:left="160" w:right="160"/>
     </w:pPr>
     <w:rPr>
       <w:rFonts w:ascii="Liberation Mono" w:hAnsi="Liberation Mono" w:eastAsia="Liberation Mono" w:cs="Liberation Mono"/>
@@ -5643,15 +6108,14 @@
     <w:qFormat/>
     <w:pPr>
       <w:pBdr>
-        <w:left w:val="single" w:sz="24" w:space="10" w:color="008074"/>
+        <w:left w:val="single" w:sz="28" w:space="12" w:color="00D190"/>
       </w:pBdr>
-      <w:spacing w:before="140" w:after="140"/>
-      <w:ind w:hanging="0" w:left="140" w:right="140"/>
+      <w:shd w:fill="E9F7F0" w:val="clear"/>
+      <w:spacing w:before="160" w:after="160"/>
+      <w:ind w:hanging="0" w:left="160" w:right="160"/>
     </w:pPr>
     <w:rPr>
-      <w:i/>
-      <w:iCs/>
-      <w:color w:val="3D5261"/>
+      <w:color w:val="1F4D40"/>
     </w:rPr>
   </w:style>
   <w:style w:type="paragraph" w:styleId="TableHeading">
@@ -5660,7 +6124,7 @@
     <w:qFormat/>
     <w:pPr>
       <w:suppressLineNumbers/>
-      <w:shd w:fill="083469" w:val="clear"/>
+      <w:shd w:fill="008074" w:val="clear"/>
       <w:jc w:val="left"/>
     </w:pPr>
     <w:rPr>

</xml_diff>